<commit_message>
feat(jw): bind role skills and evidence-calibrated solar outputs
</commit_message>
<xml_diff>
--- a/docs/SILSO太阳活动周形态实验-P5-P6评委展示稿.docx
+++ b/docs/SILSO太阳活动周形态实验-P5-P6评委展示稿.docx
@@ -45,7 +45,7 @@
                 <w:color w:val="DCEDF3"/>
                 <w:sz w:val="20"/>
               </w:rPr>
-              <w:t>独立 SILSO v2.0 太阳活动周形态实验｜已结束周期 1—24</w:t>
+              <w:t>三个优先科学假设：WDC–SILSO Version 2.0 数据与分层证据</w:t>
             </w:r>
           </w:p>
         </w:tc>
@@ -91,7 +91,7 @@
               <w:rPr>
                 <w:sz w:val="18"/>
               </w:rPr>
-              <w:t>只研究历史完整周期中的统计关系；第 25 周仅作边界，不分析或预测第 26 周，也不作太阳发电机因果机制证明。</w:t>
+              <w:t>本稿采用 WDC–SILSO Version 2.0 官方太阳黑子数数据产品。人工证伪审查核对变量定义、物理方向、时间顺序和撤回条件；三条假设的统计支持仍分别由历史分析、样本外回测和数据可得性决定。</w:t>
             </w:r>
           </w:p>
         </w:tc>
@@ -162,7 +162,7 @@
         </w:tc>
         <w:tc>
           <w:tcPr>
-            <w:tcW w:type="dxa" w:w="2324"/>
+            <w:tcW w:type="dxa" w:w="2835"/>
             <w:vAlign w:val="center"/>
             <w:tcMar>
               <w:top w:w="80" w:type="dxa"/>
@@ -196,7 +196,7 @@
         </w:tc>
         <w:tc>
           <w:tcPr>
-            <w:tcW w:type="dxa" w:w="3118"/>
+            <w:tcW w:type="dxa" w:w="3005"/>
             <w:vAlign w:val="center"/>
             <w:tcMar>
               <w:top w:w="80" w:type="dxa"/>
@@ -230,7 +230,7 @@
         </w:tc>
         <w:tc>
           <w:tcPr>
-            <w:tcW w:type="dxa" w:w="2324"/>
+            <w:tcW w:type="dxa" w:w="2891"/>
             <w:vAlign w:val="center"/>
             <w:tcMar>
               <w:top w:w="80" w:type="dxa"/>
@@ -264,7 +264,7 @@
         </w:tc>
         <w:tc>
           <w:tcPr>
-            <w:tcW w:type="dxa" w:w="624"/>
+            <w:tcW w:type="dxa" w:w="737"/>
             <w:vAlign w:val="center"/>
             <w:tcMar>
               <w:top w:w="80" w:type="dxa"/>
@@ -326,7 +326,7 @@
         </w:tc>
         <w:tc>
           <w:tcPr>
-            <w:tcW w:type="dxa" w:w="2324"/>
+            <w:tcW w:type="dxa" w:w="2835"/>
             <w:vAlign w:val="center"/>
             <w:tcMar>
               <w:top w:w="80" w:type="dxa"/>
@@ -346,13 +346,13 @@
                 <w:b w:val="0"/>
                 <w:sz w:val="17"/>
               </w:rPr>
-              <w:t>官方极值定义下，上升时间越短，峰值强度通常越高。</w:t>
+              <w:t>统一官方边界与峰值定义下，上升时间越短，活动周峰值通常越高。</w:t>
             </w:r>
           </w:p>
         </w:tc>
         <w:tc>
           <w:tcPr>
-            <w:tcW w:type="dxa" w:w="3118"/>
+            <w:tcW w:type="dxa" w:w="3005"/>
             <w:vAlign w:val="center"/>
             <w:tcMar>
               <w:top w:w="80" w:type="dxa"/>
@@ -372,13 +372,13 @@
                 <w:b w:val="0"/>
                 <w:sz w:val="17"/>
               </w:rPr>
-              <w:t>两种相关量均为负；两类区间低于 0；留一方向不变；两个时期方向一致。</w:t>
+              <w:t>Pearson、Spearman 同向为负；bootstrap 区间均低于 0；留一和固定分期不改方向。</w:t>
             </w:r>
           </w:p>
         </w:tc>
         <w:tc>
           <w:tcPr>
-            <w:tcW w:type="dxa" w:w="2324"/>
+            <w:tcW w:type="dxa" w:w="2891"/>
             <w:vAlign w:val="center"/>
             <w:tcMar>
               <w:top w:w="80" w:type="dxa"/>
@@ -398,13 +398,13 @@
                 <w:b w:val="0"/>
                 <w:sz w:val="17"/>
               </w:rPr>
-              <w:t>高（仅限样本内方向）；因果与跨版本外推不评级。</w:t>
+              <w:t>高（历史描述性）；证据链完整，但不外推为因果或未来预测。</w:t>
             </w:r>
           </w:p>
         </w:tc>
         <w:tc>
           <w:tcPr>
-            <w:tcW w:type="dxa" w:w="624"/>
+            <w:tcW w:type="dxa" w:w="737"/>
             <w:vAlign w:val="center"/>
             <w:tcMar>
               <w:top w:w="80" w:type="dxa"/>
@@ -424,7 +424,7 @@
                 <w:b w:val="0"/>
                 <w:sz w:val="17"/>
               </w:rPr>
-              <w:t>1</w:t>
+              <w:t>中</w:t>
             </w:r>
           </w:p>
         </w:tc>
@@ -459,7 +459,7 @@
         </w:tc>
         <w:tc>
           <w:tcPr>
-            <w:tcW w:type="dxa" w:w="2324"/>
+            <w:tcW w:type="dxa" w:w="2835"/>
             <w:vAlign w:val="center"/>
             <w:tcMar>
               <w:top w:w="80" w:type="dxa"/>
@@ -480,13 +480,13 @@
                 <w:b w:val="0"/>
                 <w:sz w:val="17"/>
               </w:rPr>
-              <w:t>周期总长度的负向迹象不足以构成稳定规律。</w:t>
+              <w:t>极小期大尺度极区场能够改善下一活动周峰值预测。</w:t>
             </w:r>
           </w:p>
         </w:tc>
         <w:tc>
           <w:tcPr>
-            <w:tcW w:type="dxa" w:w="3118"/>
+            <w:tcW w:type="dxa" w:w="3005"/>
             <w:vAlign w:val="center"/>
             <w:tcMar>
               <w:top w:w="80" w:type="dxa"/>
@@ -507,13 +507,13 @@
                 <w:b w:val="0"/>
                 <w:sz w:val="17"/>
               </w:rPr>
-              <w:t>点估计为负，但双侧 p 值未达常用阈值，两类区间均跨 0。</w:t>
+              <w:t>严格时序回测中候选 MAE 低于两类基线；新增留出折需继续验证改善是否稳定。</w:t>
             </w:r>
           </w:p>
         </w:tc>
         <w:tc>
           <w:tcPr>
-            <w:tcW w:type="dxa" w:w="2324"/>
+            <w:tcW w:type="dxa" w:w="2891"/>
             <w:vAlign w:val="center"/>
             <w:tcMar>
               <w:top w:w="80" w:type="dxa"/>
@@ -534,13 +534,13 @@
                 <w:b w:val="0"/>
                 <w:sz w:val="17"/>
               </w:rPr>
-              <w:t>中；支持‘证据不足’。</w:t>
+              <w:t>中低（方向性增益信号）；点估计改善 13.053，但 95% 区间仍跨 0。</w:t>
             </w:r>
           </w:p>
         </w:tc>
         <w:tc>
           <w:tcPr>
-            <w:tcW w:type="dxa" w:w="624"/>
+            <w:tcW w:type="dxa" w:w="737"/>
             <w:vAlign w:val="center"/>
             <w:tcMar>
               <w:top w:w="80" w:type="dxa"/>
@@ -561,7 +561,7 @@
                 <w:b w:val="0"/>
                 <w:sz w:val="17"/>
               </w:rPr>
-              <w:t>2</w:t>
+              <w:t>高</w:t>
             </w:r>
           </w:p>
         </w:tc>
@@ -595,7 +595,7 @@
         </w:tc>
         <w:tc>
           <w:tcPr>
-            <w:tcW w:type="dxa" w:w="2324"/>
+            <w:tcW w:type="dxa" w:w="2835"/>
             <w:vAlign w:val="center"/>
             <w:tcMar>
               <w:top w:w="80" w:type="dxa"/>
@@ -615,13 +615,13 @@
                 <w:b w:val="0"/>
                 <w:sz w:val="17"/>
               </w:rPr>
-              <w:t>下降时间—峰值关系具有时期和度量依赖性。</w:t>
+              <w:t>轴向偶极矩比普通极区孔径场提供额外预测信息。</w:t>
             </w:r>
           </w:p>
         </w:tc>
         <w:tc>
           <w:tcPr>
-            <w:tcW w:type="dxa" w:w="3118"/>
+            <w:tcW w:type="dxa" w:w="3005"/>
             <w:vAlign w:val="center"/>
             <w:tcMar>
               <w:top w:w="80" w:type="dxa"/>
@@ -641,13 +641,13 @@
                 <w:b w:val="0"/>
                 <w:sz w:val="17"/>
               </w:rPr>
-              <w:t>Pearson 与 Spearman 的不确定性结论不一致；现代组接近 0。</w:t>
+              <w:t>同一留出协议下，轴向偶极矩相对孔径场稳定降低误差并通过敏感性检查。</w:t>
             </w:r>
           </w:p>
         </w:tc>
         <w:tc>
           <w:tcPr>
-            <w:tcW w:type="dxa" w:w="2324"/>
+            <w:tcW w:type="dxa" w:w="2891"/>
             <w:vAlign w:val="center"/>
             <w:tcMar>
               <w:top w:w="80" w:type="dxa"/>
@@ -667,13 +667,13 @@
                 <w:b w:val="0"/>
                 <w:sz w:val="17"/>
               </w:rPr>
-              <w:t>中高；多项敏感性结果一致指向不稳定。</w:t>
+              <w:t>暂不可评级（研究价值高）；物理构造已区分，实证输入待补齐。</w:t>
             </w:r>
           </w:p>
         </w:tc>
         <w:tc>
           <w:tcPr>
-            <w:tcW w:type="dxa" w:w="624"/>
+            <w:tcW w:type="dxa" w:w="737"/>
             <w:vAlign w:val="center"/>
             <w:tcMar>
               <w:top w:w="80" w:type="dxa"/>
@@ -693,7 +693,7 @@
                 <w:b w:val="0"/>
                 <w:sz w:val="17"/>
               </w:rPr>
-              <w:t>2</w:t>
+              <w:t>高</w:t>
             </w:r>
           </w:p>
         </w:tc>
@@ -747,12 +747,63 @@
               <w:rPr>
                 <w:sz w:val="18"/>
               </w:rPr>
-              <w:t>注册 SILSO v2.0 输入 → 官方周期边界 → 24 行逐周期表 → 三类相关与不确定性 → 留一/分时期稳健性 → 独立沙箱核验 → Evidence review。</w:t>
+              <w:t>WDC–SILSO Version 2.0 官方数据 → H1 历史形态统计 → H2 极区场时间顺序回测 → H3 轴向偶极矩数据核对 → 人工证伪审查 → 分层结论。</w:t>
             </w:r>
           </w:p>
         </w:tc>
       </w:tr>
     </w:tbl>
+    <w:p>
+      <w:pPr>
+        <w:jc w:val="center"/>
+      </w:pPr>
+      <w:r>
+        <w:drawing>
+          <wp:inline xmlns:a="http://schemas.openxmlformats.org/drawingml/2006/main" xmlns:pic="http://schemas.openxmlformats.org/drawingml/2006/picture">
+            <wp:extent cx="6217920" cy="2898183"/>
+            <wp:docPr id="3" name="Picture 3"/>
+            <wp:cNvGraphicFramePr>
+              <a:graphicFrameLocks noChangeAspect="1"/>
+            </wp:cNvGraphicFramePr>
+            <a:graphic>
+              <a:graphicData uri="http://schemas.openxmlformats.org/drawingml/2006/picture">
+                <pic:pic>
+                  <pic:nvPicPr>
+                    <pic:cNvPr id="0" name="silso_hypotheses_mechanism_zh.png"/>
+                    <pic:cNvPicPr/>
+                  </pic:nvPicPr>
+                  <pic:blipFill>
+                    <a:blip r:embed="rId13"/>
+                    <a:stretch>
+                      <a:fillRect/>
+                    </a:stretch>
+                  </pic:blipFill>
+                  <pic:spPr>
+                    <a:xfrm>
+                      <a:off x="0" y="0"/>
+                      <a:ext cx="6217920" cy="2898183"/>
+                    </a:xfrm>
+                    <a:prstGeom prst="rect"/>
+                  </pic:spPr>
+                </pic:pic>
+              </a:graphicData>
+            </a:graphic>
+          </wp:inline>
+        </w:drawing>
+      </w:r>
+    </w:p>
+    <w:p>
+      <w:pPr>
+        <w:jc w:val="center"/>
+      </w:pPr>
+      <w:r>
+        <w:rPr>
+          <w:i/>
+          <w:sz w:val="19"/>
+        </w:rPr>
+        <w:t>图 1｜三个假设的共同物理主线；中文说明为主，Polar field、Toroidal field、Rise time、Axial dipole moment 等专业名词保留 English；图形由 Visio 原生形状绘制。</w:t>
+      </w:r>
+    </w:p>
     <w:p>
       <w:pPr>
         <w:spacing w:after="0"/>
@@ -764,7 +815,7 @@
         <w:ind w:left="283" w:hanging="113"/>
       </w:pPr>
       <w:r>
-        <w:t>时间量统一按官方年月差除以 12；每行一个完整活动周。</w:t>
+        <w:t>H1 使用第 1—24 个完整活动周，按活动周为单位计算 Pearson、Spearman、bootstrap、逐周期留一与固定分期结果。</w:t>
       </w:r>
     </w:p>
     <w:p>
@@ -773,7 +824,7 @@
         <w:ind w:left="283" w:hanging="113"/>
       </w:pPr>
       <w:r>
-        <w:t>第 1—12 周与第 13—24 周在分析前固定分组，不按结果调整。</w:t>
+        <w:t>H2 使用 10 个相邻活动周对，首个训练窗口为第 15—19 周，测试第 20—24 周；MWO 1 折、WSO 4 折。</w:t>
       </w:r>
     </w:p>
     <w:p>
@@ -782,7 +833,7 @@
         <w:ind w:left="283" w:hanging="113"/>
       </w:pPr>
       <w:r>
-        <w:t>Bootstrap 以完整活动周为重采样单位，随机种子 20260826，三组关系各 10,000 次有效重复。</w:t>
+        <w:t>H3 所需全日面磁图、覆盖与固定球谐定义尚未登记；不以极区孔径场结果替代轴向偶极矩。</w:t>
       </w:r>
     </w:p>
     <w:p>
@@ -791,7 +842,7 @@
         <w:ind w:left="283" w:hanging="113"/>
       </w:pPr>
       <w:r>
-        <w:t>异常周期只报告影响，不为获得显著结果而删除。</w:t>
+        <w:t>人工证伪审查核对物理量、机制方向、时间顺序、适用条件和撤回条件，确认假设可检验。</w:t>
       </w:r>
     </w:p>
     <w:tbl>
@@ -875,7 +926,7 @@
                 <w:color w:val="FFFFFF"/>
                 <w:sz w:val="17"/>
               </w:rPr>
-              <w:t>Pearson r（p）</w:t>
+              <w:t>Pearson r（双侧 p）</w:t>
             </w:r>
           </w:p>
         </w:tc>
@@ -943,7 +994,7 @@
                 <w:color w:val="FFFFFF"/>
                 <w:sz w:val="17"/>
               </w:rPr>
-              <w:t>Spearman ρ（p）</w:t>
+              <w:t>Spearman ρ（双侧 p）</w:t>
             </w:r>
           </w:p>
         </w:tc>
@@ -1169,7 +1220,7 @@
                 <w:b w:val="0"/>
                 <w:sz w:val="17"/>
               </w:rPr>
-              <w:t>证据不足</w:t>
+              <w:t>对照关系</w:t>
             </w:r>
           </w:p>
         </w:tc>
@@ -1333,7 +1384,7 @@
                 <w:b w:val="0"/>
                 <w:sz w:val="17"/>
               </w:rPr>
-              <w:t>稳定负相关</w:t>
+              <w:t>H1 主证据</w:t>
             </w:r>
           </w:p>
         </w:tc>
@@ -1491,381 +1542,7 @@
                 <w:b w:val="0"/>
                 <w:sz w:val="17"/>
               </w:rPr>
-              <w:t>时期/度量依赖</w:t>
-            </w:r>
-          </w:p>
-        </w:tc>
-      </w:tr>
-    </w:tbl>
-    <w:p>
-      <w:pPr>
-        <w:spacing w:after="0"/>
-      </w:pPr>
-    </w:p>
-    <w:p>
-      <w:pPr>
-        <w:pStyle w:val="Heading2"/>
-      </w:pPr>
-      <w:r>
-        <w:t>5.3 置信度分层</w:t>
-      </w:r>
-    </w:p>
-    <w:tbl>
-      <w:tblPr>
-        <w:tblStyle w:val="TableGrid"/>
-        <w:tblW w:type="auto" w:w="0"/>
-        <w:jc w:val="center"/>
-        <w:tblLayout w:type="fixed"/>
-        <w:tblLook w:firstColumn="1" w:firstRow="1" w:lastColumn="0" w:lastRow="0" w:noHBand="0" w:noVBand="1" w:val="04A0"/>
-      </w:tblPr>
-      <w:tblGrid>
-        <w:gridCol w:w="3383"/>
-        <w:gridCol w:w="3383"/>
-        <w:gridCol w:w="3383"/>
-      </w:tblGrid>
-      <w:tr>
-        <w:tc>
-          <w:tcPr>
-            <w:tcW w:type="dxa" w:w="3005"/>
-            <w:vAlign w:val="center"/>
-            <w:tcMar>
-              <w:top w:w="80" w:type="dxa"/>
-              <w:start w:w="90" w:type="dxa"/>
-              <w:bottom w:w="80" w:type="dxa"/>
-              <w:end w:w="90" w:type="dxa"/>
-            </w:tcMar>
-            <w:shd w:fill="173F5F"/>
-          </w:tcPr>
-          <w:p>
-            <w:pPr>
-              <w:spacing w:after="0" w:line="252" w:lineRule="auto"/>
-            </w:pPr>
-            <w:r>
-              <w:rPr>
-                <w:b/>
-                <w:color w:val="FFFFFF"/>
-                <w:sz w:val="17"/>
-              </w:rPr>
-            </w:r>
-            <w:r>
-              <w:rPr>
-                <w:rFonts w:ascii="Noto Sans CJK SC" w:hAnsi="Noto Sans CJK SC" w:eastAsia="Noto Sans CJK SC"/>
-                <w:b/>
-                <w:color w:val="FFFFFF"/>
-                <w:sz w:val="17"/>
-              </w:rPr>
-              <w:t>结论</w:t>
-            </w:r>
-          </w:p>
-        </w:tc>
-        <w:tc>
-          <w:tcPr>
-            <w:tcW w:type="dxa" w:w="1587"/>
-            <w:vAlign w:val="center"/>
-            <w:tcMar>
-              <w:top w:w="80" w:type="dxa"/>
-              <w:start w:w="90" w:type="dxa"/>
-              <w:bottom w:w="80" w:type="dxa"/>
-              <w:end w:w="90" w:type="dxa"/>
-            </w:tcMar>
-            <w:shd w:fill="173F5F"/>
-          </w:tcPr>
-          <w:p>
-            <w:pPr>
-              <w:spacing w:after="0" w:line="252" w:lineRule="auto"/>
-            </w:pPr>
-            <w:r>
-              <w:rPr>
-                <w:b/>
-                <w:color w:val="FFFFFF"/>
-                <w:sz w:val="17"/>
-              </w:rPr>
-            </w:r>
-            <w:r>
-              <w:rPr>
-                <w:rFonts w:ascii="Noto Sans CJK SC" w:hAnsi="Noto Sans CJK SC" w:eastAsia="Noto Sans CJK SC"/>
-                <w:b/>
-                <w:color w:val="FFFFFF"/>
-                <w:sz w:val="17"/>
-              </w:rPr>
-              <w:t>checkpoint 置信度</w:t>
-            </w:r>
-          </w:p>
-        </w:tc>
-        <w:tc>
-          <w:tcPr>
-            <w:tcW w:type="dxa" w:w="5216"/>
-            <w:vAlign w:val="center"/>
-            <w:tcMar>
-              <w:top w:w="80" w:type="dxa"/>
-              <w:start w:w="90" w:type="dxa"/>
-              <w:bottom w:w="80" w:type="dxa"/>
-              <w:end w:w="90" w:type="dxa"/>
-            </w:tcMar>
-            <w:shd w:fill="173F5F"/>
-          </w:tcPr>
-          <w:p>
-            <w:pPr>
-              <w:spacing w:after="0" w:line="252" w:lineRule="auto"/>
-            </w:pPr>
-            <w:r>
-              <w:rPr>
-                <w:b/>
-                <w:color w:val="FFFFFF"/>
-                <w:sz w:val="17"/>
-              </w:rPr>
-            </w:r>
-            <w:r>
-              <w:rPr>
-                <w:rFonts w:ascii="Noto Sans CJK SC" w:hAnsi="Noto Sans CJK SC" w:eastAsia="Noto Sans CJK SC"/>
-                <w:b/>
-                <w:color w:val="FFFFFF"/>
-                <w:sz w:val="17"/>
-              </w:rPr>
-              <w:t>依据摘要</w:t>
-            </w:r>
-          </w:p>
-        </w:tc>
-      </w:tr>
-      <w:tr>
-        <w:tc>
-          <w:tcPr>
-            <w:tcW w:type="dxa" w:w="3005"/>
-            <w:vAlign w:val="center"/>
-            <w:tcMar>
-              <w:top w:w="80" w:type="dxa"/>
-              <w:start w:w="90" w:type="dxa"/>
-              <w:bottom w:w="80" w:type="dxa"/>
-              <w:end w:w="90" w:type="dxa"/>
-            </w:tcMar>
-          </w:tcPr>
-          <w:p>
-            <w:pPr>
-              <w:spacing w:after="0" w:line="252" w:lineRule="auto"/>
-            </w:pPr>
-            <w:r/>
-            <w:r>
-              <w:rPr>
-                <w:rFonts w:ascii="Noto Sans CJK SC" w:hAnsi="Noto Sans CJK SC" w:eastAsia="Noto Sans CJK SC"/>
-                <w:b w:val="0"/>
-                <w:sz w:val="17"/>
-              </w:rPr>
-              <w:t>上升时间与峰值强度的历史负相关</w:t>
-            </w:r>
-          </w:p>
-        </w:tc>
-        <w:tc>
-          <w:tcPr>
-            <w:tcW w:type="dxa" w:w="1587"/>
-            <w:vAlign w:val="center"/>
-            <w:tcMar>
-              <w:top w:w="80" w:type="dxa"/>
-              <w:start w:w="90" w:type="dxa"/>
-              <w:bottom w:w="80" w:type="dxa"/>
-              <w:end w:w="90" w:type="dxa"/>
-            </w:tcMar>
-          </w:tcPr>
-          <w:p>
-            <w:pPr>
-              <w:spacing w:after="0" w:line="252" w:lineRule="auto"/>
-            </w:pPr>
-            <w:r/>
-            <w:r>
-              <w:rPr>
-                <w:rFonts w:ascii="Noto Sans CJK SC" w:hAnsi="Noto Sans CJK SC" w:eastAsia="Noto Sans CJK SC"/>
-                <w:b w:val="0"/>
-                <w:sz w:val="17"/>
-              </w:rPr>
-              <w:t>high</w:t>
-            </w:r>
-          </w:p>
-        </w:tc>
-        <w:tc>
-          <w:tcPr>
-            <w:tcW w:type="dxa" w:w="5216"/>
-            <w:vAlign w:val="center"/>
-            <w:tcMar>
-              <w:top w:w="80" w:type="dxa"/>
-              <w:start w:w="90" w:type="dxa"/>
-              <w:bottom w:w="80" w:type="dxa"/>
-              <w:end w:w="90" w:type="dxa"/>
-            </w:tcMar>
-          </w:tcPr>
-          <w:p>
-            <w:pPr>
-              <w:spacing w:after="0" w:line="252" w:lineRule="auto"/>
-            </w:pPr>
-            <w:r/>
-            <w:r>
-              <w:rPr>
-                <w:rFonts w:ascii="Noto Sans CJK SC" w:hAnsi="Noto Sans CJK SC" w:eastAsia="Noto Sans CJK SC"/>
-                <w:b w:val="0"/>
-                <w:sz w:val="17"/>
-              </w:rPr>
-              <w:t>在 SILSO v2.0 第 1—24 周中，Pearson 与 Spearman 方向一致、双侧 p 值均小于 0.0001、两种 bootstrap 区间均完全低于零、24 次留一方向全部为负、早期与较现代子期点估计均为负。所有预注册 Waldmeier 支持条件均满足。但样本仅 24 个独立周期，且为相关关系，不能证明因果机制或外推到未来活动周。置信度严格限定在该样本与分析口径内的方向描述。</w:t>
-            </w:r>
-          </w:p>
-        </w:tc>
-      </w:tr>
-      <w:tr>
-        <w:tc>
-          <w:tcPr>
-            <w:tcW w:type="dxa" w:w="3005"/>
-            <w:vAlign w:val="center"/>
-            <w:tcMar>
-              <w:top w:w="80" w:type="dxa"/>
-              <w:start w:w="90" w:type="dxa"/>
-              <w:bottom w:w="80" w:type="dxa"/>
-              <w:end w:w="90" w:type="dxa"/>
-            </w:tcMar>
-            <w:shd w:fill="F3F5F7"/>
-          </w:tcPr>
-          <w:p>
-            <w:pPr>
-              <w:spacing w:after="0" w:line="252" w:lineRule="auto"/>
-            </w:pPr>
-            <w:r/>
-            <w:r>
-              <w:rPr>
-                <w:rFonts w:ascii="Noto Sans CJK SC" w:hAnsi="Noto Sans CJK SC" w:eastAsia="Noto Sans CJK SC"/>
-                <w:b w:val="0"/>
-                <w:sz w:val="17"/>
-              </w:rPr>
-              <w:t>周期长度与峰值强度的稳定关系</w:t>
-            </w:r>
-          </w:p>
-        </w:tc>
-        <w:tc>
-          <w:tcPr>
-            <w:tcW w:type="dxa" w:w="1587"/>
-            <w:vAlign w:val="center"/>
-            <w:tcMar>
-              <w:top w:w="80" w:type="dxa"/>
-              <w:start w:w="90" w:type="dxa"/>
-              <w:bottom w:w="80" w:type="dxa"/>
-              <w:end w:w="90" w:type="dxa"/>
-            </w:tcMar>
-            <w:shd w:fill="F3F5F7"/>
-          </w:tcPr>
-          <w:p>
-            <w:pPr>
-              <w:spacing w:after="0" w:line="252" w:lineRule="auto"/>
-            </w:pPr>
-            <w:r/>
-            <w:r>
-              <w:rPr>
-                <w:rFonts w:ascii="Noto Sans CJK SC" w:hAnsi="Noto Sans CJK SC" w:eastAsia="Noto Sans CJK SC"/>
-                <w:b w:val="0"/>
-                <w:sz w:val="17"/>
-              </w:rPr>
-              <w:t>low</w:t>
-            </w:r>
-          </w:p>
-        </w:tc>
-        <w:tc>
-          <w:tcPr>
-            <w:tcW w:type="dxa" w:w="5216"/>
-            <w:vAlign w:val="center"/>
-            <w:tcMar>
-              <w:top w:w="80" w:type="dxa"/>
-              <w:start w:w="90" w:type="dxa"/>
-              <w:bottom w:w="80" w:type="dxa"/>
-              <w:end w:w="90" w:type="dxa"/>
-            </w:tcMar>
-            <w:shd w:fill="F3F5F7"/>
-          </w:tcPr>
-          <w:p>
-            <w:pPr>
-              <w:spacing w:after="0" w:line="252" w:lineRule="auto"/>
-            </w:pPr>
-            <w:r/>
-            <w:r>
-              <w:rPr>
-                <w:rFonts w:ascii="Noto Sans CJK SC" w:hAnsi="Noto Sans CJK SC" w:eastAsia="Noto Sans CJK SC"/>
-                <w:b w:val="0"/>
-                <w:sz w:val="17"/>
-              </w:rPr>
-              <w:t>Pearson 与 Spearman 点估计均为负，但两种 bootstrap 区间均跨零，双侧 p 值均大于常规显著性阈值，子期各仅 12 个周期且不确定性较大。当前证据不足以判为方向一致的统计关系。</w:t>
-            </w:r>
-          </w:p>
-        </w:tc>
-      </w:tr>
-      <w:tr>
-        <w:tc>
-          <w:tcPr>
-            <w:tcW w:type="dxa" w:w="3005"/>
-            <w:vAlign w:val="center"/>
-            <w:tcMar>
-              <w:top w:w="80" w:type="dxa"/>
-              <w:start w:w="90" w:type="dxa"/>
-              <w:bottom w:w="80" w:type="dxa"/>
-              <w:end w:w="90" w:type="dxa"/>
-            </w:tcMar>
-          </w:tcPr>
-          <w:p>
-            <w:pPr>
-              <w:spacing w:after="0" w:line="252" w:lineRule="auto"/>
-            </w:pPr>
-            <w:r/>
-            <w:r>
-              <w:rPr>
-                <w:rFonts w:ascii="Noto Sans CJK SC" w:hAnsi="Noto Sans CJK SC" w:eastAsia="Noto Sans CJK SC"/>
-                <w:b w:val="0"/>
-                <w:sz w:val="17"/>
-              </w:rPr>
-              <w:t>下降时间与峰值强度的稳定关系</w:t>
-            </w:r>
-          </w:p>
-        </w:tc>
-        <w:tc>
-          <w:tcPr>
-            <w:tcW w:type="dxa" w:w="1587"/>
-            <w:vAlign w:val="center"/>
-            <w:tcMar>
-              <w:top w:w="80" w:type="dxa"/>
-              <w:start w:w="90" w:type="dxa"/>
-              <w:bottom w:w="80" w:type="dxa"/>
-              <w:end w:w="90" w:type="dxa"/>
-            </w:tcMar>
-          </w:tcPr>
-          <w:p>
-            <w:pPr>
-              <w:spacing w:after="0" w:line="252" w:lineRule="auto"/>
-            </w:pPr>
-            <w:r/>
-            <w:r>
-              <w:rPr>
-                <w:rFonts w:ascii="Noto Sans CJK SC" w:hAnsi="Noto Sans CJK SC" w:eastAsia="Noto Sans CJK SC"/>
-                <w:b w:val="0"/>
-                <w:sz w:val="17"/>
-              </w:rPr>
-              <w:t>low</w:t>
-            </w:r>
-          </w:p>
-        </w:tc>
-        <w:tc>
-          <w:tcPr>
-            <w:tcW w:type="dxa" w:w="5216"/>
-            <w:vAlign w:val="center"/>
-            <w:tcMar>
-              <w:top w:w="80" w:type="dxa"/>
-              <w:start w:w="90" w:type="dxa"/>
-              <w:bottom w:w="80" w:type="dxa"/>
-              <w:end w:w="90" w:type="dxa"/>
-            </w:tcMar>
-          </w:tcPr>
-          <w:p>
-            <w:pPr>
-              <w:spacing w:after="0" w:line="252" w:lineRule="auto"/>
-            </w:pPr>
-            <w:r/>
-            <w:r>
-              <w:rPr>
-                <w:rFonts w:ascii="Noto Sans CJK SC" w:hAnsi="Noto Sans CJK SC" w:eastAsia="Noto Sans CJK SC"/>
-                <w:b w:val="0"/>
-                <w:sz w:val="17"/>
-              </w:rPr>
-              <w:t>Pearson 点估计为正但双侧 p=0.0649 未达常规显著性阈值，Spearman 区间跨零，早期与较现代子期结果不一致。不能将该关系表述为跨时期一致的统计规律。</w:t>
+              <w:t>对照：方向不稳定</w:t>
             </w:r>
           </w:p>
         </w:tc>
@@ -1905,13 +1582,13 @@
                 <w:b/>
                 <w:color w:val="1E6F74"/>
               </w:rPr>
-              <w:t xml:space="preserve">解释  </w:t>
+              <w:t xml:space="preserve">H2 回测摘要  </w:t>
             </w:r>
             <w:r>
               <w:rPr>
                 <w:sz w:val="18"/>
               </w:rPr>
-              <w:t>high 只适用于直接核验、严格限定在本实验样本和统计口径内的描述性结论；不代表因果机制或样本外预测置信度。</w:t>
+              <w:t>5 个严格时序留出折：候选 MAE 26.972，优于均值 40.026 和持续性 64.231；改善 13.053，但 95% 区间 [-6.999, 31.299] 跨 0。结论是“有方向性增益信号”，尚非稳定预测技能；H3 输入待补齐。</w:t>
             </w:r>
           </w:p>
         </w:tc>
@@ -1967,13 +1644,428 @@
         <w:jc w:val="center"/>
       </w:pPr>
       <w:r>
-        <w:rPr>
-          <w:i/>
-          <w:color w:val="5C6C75"/>
-          <w:sz w:val="17"/>
-        </w:rPr>
-        <w:t>图 1｜三种形态变量与峰值强度。点标注周期编号，颜色区分预固定时期；拟合线只描述统计关系。</w:t>
+        <w:t>图 2｜第 1—24 活动周的 Cycle length、Rise time、Decline time 与 Peak smoothed sunspot number 关系；中图为 H1 主证据。</w:t>
       </w:r>
+    </w:p>
+    <w:p>
+      <w:pPr>
+        <w:pStyle w:val="Heading2"/>
+      </w:pPr>
+      <w:r>
+        <w:t>5.3 置信度分层</w:t>
+      </w:r>
+    </w:p>
+    <w:tbl>
+      <w:tblPr>
+        <w:tblStyle w:val="TableGrid"/>
+        <w:tblW w:type="auto" w:w="0"/>
+        <w:jc w:val="center"/>
+        <w:tblLayout w:type="fixed"/>
+        <w:tblLook w:firstColumn="1" w:firstRow="1" w:lastColumn="0" w:lastRow="0" w:noHBand="0" w:noVBand="1" w:val="04A0"/>
+      </w:tblPr>
+      <w:tblGrid>
+        <w:gridCol w:w="3383"/>
+        <w:gridCol w:w="3383"/>
+        <w:gridCol w:w="3383"/>
+      </w:tblGrid>
+      <w:tr>
+        <w:tc>
+          <w:tcPr>
+            <w:tcW w:type="dxa" w:w="2835"/>
+            <w:vAlign w:val="center"/>
+            <w:tcMar>
+              <w:top w:w="80" w:type="dxa"/>
+              <w:start w:w="90" w:type="dxa"/>
+              <w:bottom w:w="80" w:type="dxa"/>
+              <w:end w:w="90" w:type="dxa"/>
+            </w:tcMar>
+            <w:shd w:fill="173F5F"/>
+          </w:tcPr>
+          <w:p>
+            <w:pPr>
+              <w:spacing w:after="0" w:line="252" w:lineRule="auto"/>
+            </w:pPr>
+            <w:r>
+              <w:rPr>
+                <w:b/>
+                <w:color w:val="FFFFFF"/>
+                <w:sz w:val="17"/>
+              </w:rPr>
+            </w:r>
+            <w:r>
+              <w:rPr>
+                <w:rFonts w:ascii="Noto Sans CJK SC" w:hAnsi="Noto Sans CJK SC" w:eastAsia="Noto Sans CJK SC"/>
+                <w:b/>
+                <w:color w:val="FFFFFF"/>
+                <w:sz w:val="17"/>
+              </w:rPr>
+              <w:t>结论</w:t>
+            </w:r>
+          </w:p>
+        </w:tc>
+        <w:tc>
+          <w:tcPr>
+            <w:tcW w:type="dxa" w:w="1361"/>
+            <w:vAlign w:val="center"/>
+            <w:tcMar>
+              <w:top w:w="80" w:type="dxa"/>
+              <w:start w:w="90" w:type="dxa"/>
+              <w:bottom w:w="80" w:type="dxa"/>
+              <w:end w:w="90" w:type="dxa"/>
+            </w:tcMar>
+            <w:shd w:fill="173F5F"/>
+          </w:tcPr>
+          <w:p>
+            <w:pPr>
+              <w:spacing w:after="0" w:line="252" w:lineRule="auto"/>
+            </w:pPr>
+            <w:r>
+              <w:rPr>
+                <w:b/>
+                <w:color w:val="FFFFFF"/>
+                <w:sz w:val="17"/>
+              </w:rPr>
+            </w:r>
+            <w:r>
+              <w:rPr>
+                <w:rFonts w:ascii="Noto Sans CJK SC" w:hAnsi="Noto Sans CJK SC" w:eastAsia="Noto Sans CJK SC"/>
+                <w:b/>
+                <w:color w:val="FFFFFF"/>
+                <w:sz w:val="17"/>
+              </w:rPr>
+              <w:t>置信度</w:t>
+            </w:r>
+          </w:p>
+        </w:tc>
+        <w:tc>
+          <w:tcPr>
+            <w:tcW w:type="dxa" w:w="5613"/>
+            <w:vAlign w:val="center"/>
+            <w:tcMar>
+              <w:top w:w="80" w:type="dxa"/>
+              <w:start w:w="90" w:type="dxa"/>
+              <w:bottom w:w="80" w:type="dxa"/>
+              <w:end w:w="90" w:type="dxa"/>
+            </w:tcMar>
+            <w:shd w:fill="173F5F"/>
+          </w:tcPr>
+          <w:p>
+            <w:pPr>
+              <w:spacing w:after="0" w:line="252" w:lineRule="auto"/>
+            </w:pPr>
+            <w:r>
+              <w:rPr>
+                <w:b/>
+                <w:color w:val="FFFFFF"/>
+                <w:sz w:val="17"/>
+              </w:rPr>
+            </w:r>
+            <w:r>
+              <w:rPr>
+                <w:rFonts w:ascii="Noto Sans CJK SC" w:hAnsi="Noto Sans CJK SC" w:eastAsia="Noto Sans CJK SC"/>
+                <w:b/>
+                <w:color w:val="FFFFFF"/>
+                <w:sz w:val="17"/>
+              </w:rPr>
+              <w:t>依据摘要</w:t>
+            </w:r>
+          </w:p>
+        </w:tc>
+      </w:tr>
+      <w:tr>
+        <w:tc>
+          <w:tcPr>
+            <w:tcW w:type="dxa" w:w="2835"/>
+            <w:vAlign w:val="center"/>
+            <w:tcMar>
+              <w:top w:w="80" w:type="dxa"/>
+              <w:start w:w="90" w:type="dxa"/>
+              <w:bottom w:w="80" w:type="dxa"/>
+              <w:end w:w="90" w:type="dxa"/>
+            </w:tcMar>
+          </w:tcPr>
+          <w:p>
+            <w:pPr>
+              <w:spacing w:after="0" w:line="252" w:lineRule="auto"/>
+            </w:pPr>
+            <w:r/>
+            <w:r>
+              <w:rPr>
+                <w:rFonts w:ascii="Noto Sans CJK SC" w:hAnsi="Noto Sans CJK SC" w:eastAsia="Noto Sans CJK SC"/>
+                <w:b w:val="0"/>
+                <w:sz w:val="17"/>
+              </w:rPr>
+              <w:t>H1：上升时间—峰值历史负相关</w:t>
+            </w:r>
+          </w:p>
+        </w:tc>
+        <w:tc>
+          <w:tcPr>
+            <w:tcW w:type="dxa" w:w="1361"/>
+            <w:vAlign w:val="center"/>
+            <w:tcMar>
+              <w:top w:w="80" w:type="dxa"/>
+              <w:start w:w="90" w:type="dxa"/>
+              <w:bottom w:w="80" w:type="dxa"/>
+              <w:end w:w="90" w:type="dxa"/>
+            </w:tcMar>
+          </w:tcPr>
+          <w:p>
+            <w:pPr>
+              <w:spacing w:after="0" w:line="252" w:lineRule="auto"/>
+            </w:pPr>
+            <w:r/>
+            <w:r>
+              <w:rPr>
+                <w:rFonts w:ascii="Noto Sans CJK SC" w:hAnsi="Noto Sans CJK SC" w:eastAsia="Noto Sans CJK SC"/>
+                <w:b w:val="0"/>
+                <w:sz w:val="17"/>
+              </w:rPr>
+              <w:t>高（限域）</w:t>
+            </w:r>
+          </w:p>
+        </w:tc>
+        <w:tc>
+          <w:tcPr>
+            <w:tcW w:type="dxa" w:w="5613"/>
+            <w:vAlign w:val="center"/>
+            <w:tcMar>
+              <w:top w:w="80" w:type="dxa"/>
+              <w:start w:w="90" w:type="dxa"/>
+              <w:bottom w:w="80" w:type="dxa"/>
+              <w:end w:w="90" w:type="dxa"/>
+            </w:tcMar>
+          </w:tcPr>
+          <w:p>
+            <w:pPr>
+              <w:spacing w:after="0" w:line="252" w:lineRule="auto"/>
+            </w:pPr>
+            <w:r/>
+            <w:r>
+              <w:rPr>
+                <w:rFonts w:ascii="Noto Sans CJK SC" w:hAnsi="Noto Sans CJK SC" w:eastAsia="Noto Sans CJK SC"/>
+                <w:b w:val="0"/>
+                <w:sz w:val="17"/>
+              </w:rPr>
+              <w:t>24 个完整周期中 Pearson r=−0.7495、Spearman ρ=−0.7619；两类 bootstrap 95% 区间均低于 0，留一及分期方向一致。支持稳定历史关系，不支持因果或样本外技能。</w:t>
+            </w:r>
+          </w:p>
+        </w:tc>
+      </w:tr>
+      <w:tr>
+        <w:tc>
+          <w:tcPr>
+            <w:tcW w:type="dxa" w:w="2835"/>
+            <w:vAlign w:val="center"/>
+            <w:tcMar>
+              <w:top w:w="80" w:type="dxa"/>
+              <w:start w:w="90" w:type="dxa"/>
+              <w:bottom w:w="80" w:type="dxa"/>
+              <w:end w:w="90" w:type="dxa"/>
+            </w:tcMar>
+            <w:shd w:fill="F3F5F7"/>
+          </w:tcPr>
+          <w:p>
+            <w:pPr>
+              <w:spacing w:after="0" w:line="252" w:lineRule="auto"/>
+            </w:pPr>
+            <w:r/>
+            <w:r>
+              <w:rPr>
+                <w:rFonts w:ascii="Noto Sans CJK SC" w:hAnsi="Noto Sans CJK SC" w:eastAsia="Noto Sans CJK SC"/>
+                <w:b w:val="0"/>
+                <w:sz w:val="17"/>
+              </w:rPr>
+              <w:t>H2：极区场可能带来样本外预测增益</w:t>
+            </w:r>
+          </w:p>
+        </w:tc>
+        <w:tc>
+          <w:tcPr>
+            <w:tcW w:type="dxa" w:w="1361"/>
+            <w:vAlign w:val="center"/>
+            <w:tcMar>
+              <w:top w:w="80" w:type="dxa"/>
+              <w:start w:w="90" w:type="dxa"/>
+              <w:bottom w:w="80" w:type="dxa"/>
+              <w:end w:w="90" w:type="dxa"/>
+            </w:tcMar>
+            <w:shd w:fill="F3F5F7"/>
+          </w:tcPr>
+          <w:p>
+            <w:pPr>
+              <w:spacing w:after="0" w:line="252" w:lineRule="auto"/>
+            </w:pPr>
+            <w:r/>
+            <w:r>
+              <w:rPr>
+                <w:rFonts w:ascii="Noto Sans CJK SC" w:hAnsi="Noto Sans CJK SC" w:eastAsia="Noto Sans CJK SC"/>
+                <w:b w:val="0"/>
+                <w:sz w:val="17"/>
+              </w:rPr>
+              <w:t>中低（方向性信号）</w:t>
+            </w:r>
+          </w:p>
+        </w:tc>
+        <w:tc>
+          <w:tcPr>
+            <w:tcW w:type="dxa" w:w="5613"/>
+            <w:vAlign w:val="center"/>
+            <w:tcMar>
+              <w:top w:w="80" w:type="dxa"/>
+              <w:start w:w="90" w:type="dxa"/>
+              <w:bottom w:w="80" w:type="dxa"/>
+              <w:end w:w="90" w:type="dxa"/>
+            </w:tcMar>
+            <w:shd w:fill="F3F5F7"/>
+          </w:tcPr>
+          <w:p>
+            <w:pPr>
+              <w:spacing w:after="0" w:line="252" w:lineRule="auto"/>
+            </w:pPr>
+            <w:r/>
+            <w:r>
+              <w:rPr>
+                <w:rFonts w:ascii="Noto Sans CJK SC" w:hAnsi="Noto Sans CJK SC" w:eastAsia="Noto Sans CJK SC"/>
+                <w:b w:val="0"/>
+                <w:sz w:val="17"/>
+              </w:rPr>
+              <w:t>5 个严格时序留出折中，MAE 26.972 对比 40.026/64.231，点估计改善 13.053；但 95% 区间 [-6.999, 31.299] 跨 0，MWO 仅 1 个测试折。有增益线索，尚未跨过稳定技能门。</w:t>
+            </w:r>
+          </w:p>
+        </w:tc>
+      </w:tr>
+      <w:tr>
+        <w:tc>
+          <w:tcPr>
+            <w:tcW w:type="dxa" w:w="2835"/>
+            <w:vAlign w:val="center"/>
+            <w:tcMar>
+              <w:top w:w="80" w:type="dxa"/>
+              <w:start w:w="90" w:type="dxa"/>
+              <w:bottom w:w="80" w:type="dxa"/>
+              <w:end w:w="90" w:type="dxa"/>
+            </w:tcMar>
+          </w:tcPr>
+          <w:p>
+            <w:pPr>
+              <w:spacing w:after="0" w:line="252" w:lineRule="auto"/>
+            </w:pPr>
+            <w:r/>
+            <w:r>
+              <w:rPr>
+                <w:rFonts w:ascii="Noto Sans CJK SC" w:hAnsi="Noto Sans CJK SC" w:eastAsia="Noto Sans CJK SC"/>
+                <w:b w:val="0"/>
+                <w:sz w:val="17"/>
+              </w:rPr>
+              <w:t>H3：轴向偶极矩具有额外预测信息</w:t>
+            </w:r>
+          </w:p>
+        </w:tc>
+        <w:tc>
+          <w:tcPr>
+            <w:tcW w:type="dxa" w:w="1361"/>
+            <w:vAlign w:val="center"/>
+            <w:tcMar>
+              <w:top w:w="80" w:type="dxa"/>
+              <w:start w:w="90" w:type="dxa"/>
+              <w:bottom w:w="80" w:type="dxa"/>
+              <w:end w:w="90" w:type="dxa"/>
+            </w:tcMar>
+          </w:tcPr>
+          <w:p>
+            <w:pPr>
+              <w:spacing w:after="0" w:line="252" w:lineRule="auto"/>
+            </w:pPr>
+            <w:r/>
+            <w:r>
+              <w:rPr>
+                <w:rFonts w:ascii="Noto Sans CJK SC" w:hAnsi="Noto Sans CJK SC" w:eastAsia="Noto Sans CJK SC"/>
+                <w:b w:val="0"/>
+                <w:sz w:val="17"/>
+              </w:rPr>
+              <w:t>暂不可评级（数据待补齐）</w:t>
+            </w:r>
+          </w:p>
+        </w:tc>
+        <w:tc>
+          <w:tcPr>
+            <w:tcW w:type="dxa" w:w="5613"/>
+            <w:vAlign w:val="center"/>
+            <w:tcMar>
+              <w:top w:w="80" w:type="dxa"/>
+              <w:start w:w="90" w:type="dxa"/>
+              <w:bottom w:w="80" w:type="dxa"/>
+              <w:end w:w="90" w:type="dxa"/>
+            </w:tcMar>
+          </w:tcPr>
+          <w:p>
+            <w:pPr>
+              <w:spacing w:after="0" w:line="252" w:lineRule="auto"/>
+            </w:pPr>
+            <w:r/>
+            <w:r>
+              <w:rPr>
+                <w:rFonts w:ascii="Noto Sans CJK SC" w:hAnsi="Noto Sans CJK SC" w:eastAsia="Noto Sans CJK SC"/>
+                <w:b w:val="0"/>
+                <w:sz w:val="17"/>
+              </w:rPr>
+              <w:t>轴向偶极矩与孔径场的构造和物理含义已区分；尚无可复算的全日面磁图及固定球谐产品，不能把“尚不可评估”写成“未发现增益”。</w:t>
+            </w:r>
+          </w:p>
+        </w:tc>
+      </w:tr>
+    </w:tbl>
+    <w:p>
+      <w:pPr>
+        <w:spacing w:after="0"/>
+      </w:pPr>
+    </w:p>
+    <w:tbl>
+      <w:tblPr>
+        <w:tblW w:type="auto" w:w="0"/>
+        <w:tblLook w:firstColumn="1" w:firstRow="1" w:lastColumn="0" w:lastRow="0" w:noHBand="0" w:noVBand="1" w:val="04A0"/>
+      </w:tblPr>
+      <w:tblGrid>
+        <w:gridCol w:w="10148"/>
+      </w:tblGrid>
+      <w:tr>
+        <w:tc>
+          <w:tcPr>
+            <w:tcW w:type="dxa" w:w="10148"/>
+            <w:shd w:fill="EAF3F7"/>
+            <w:tcMar>
+              <w:top w:w="120" w:type="dxa"/>
+              <w:start w:w="150" w:type="dxa"/>
+              <w:bottom w:w="120" w:type="dxa"/>
+              <w:end w:w="150" w:type="dxa"/>
+            </w:tcMar>
+          </w:tcPr>
+          <w:p>
+            <w:pPr>
+              <w:spacing w:after="40"/>
+            </w:pPr>
+            <w:r>
+              <w:rPr>
+                <w:b/>
+                <w:color w:val="1E6F74"/>
+              </w:rPr>
+              <w:t xml:space="preserve">人工证伪审查说明  </w:t>
+            </w:r>
+            <w:r>
+              <w:rPr>
+                <w:sz w:val="18"/>
+              </w:rPr>
+              <w:t>审查确认三条假设的变量、机制方向、时间顺序和撤回条件彼此自洽；它回答“能否被检验”，不替代历史统计、样本外回测和数据登记各自回答的实证问题。三条结论不能合并成一个总置信度。</w:t>
+            </w:r>
+          </w:p>
+        </w:tc>
+      </w:tr>
+    </w:tbl>
+    <w:p>
+      <w:pPr>
+        <w:spacing w:after="0"/>
+      </w:pPr>
     </w:p>
     <w:p>
       <w:pPr>
@@ -2000,7 +2092,7 @@
       <w:tr>
         <w:tc>
           <w:tcPr>
-            <w:tcW w:type="dxa" w:w="3005"/>
+            <w:tcW w:type="dxa" w:w="3288"/>
             <w:vAlign w:val="center"/>
             <w:tcMar>
               <w:top w:w="80" w:type="dxa"/>
@@ -2034,7 +2126,7 @@
         </w:tc>
         <w:tc>
           <w:tcPr>
-            <w:tcW w:type="dxa" w:w="1134"/>
+            <w:tcW w:type="dxa" w:w="1020"/>
             <w:vAlign w:val="center"/>
             <w:tcMar>
               <w:top w:w="80" w:type="dxa"/>
@@ -2068,7 +2160,7 @@
         </w:tc>
         <w:tc>
           <w:tcPr>
-            <w:tcW w:type="dxa" w:w="1701"/>
+            <w:tcW w:type="dxa" w:w="1757"/>
             <w:vAlign w:val="center"/>
             <w:tcMar>
               <w:top w:w="80" w:type="dxa"/>
@@ -2102,7 +2194,7 @@
         </w:tc>
         <w:tc>
           <w:tcPr>
-            <w:tcW w:type="dxa" w:w="3402"/>
+            <w:tcW w:type="dxa" w:w="3231"/>
             <w:vAlign w:val="center"/>
             <w:tcMar>
               <w:top w:w="80" w:type="dxa"/>
@@ -2138,7 +2230,7 @@
       <w:tr>
         <w:tc>
           <w:tcPr>
-            <w:tcW w:type="dxa" w:w="3005"/>
+            <w:tcW w:type="dxa" w:w="3288"/>
             <w:vAlign w:val="center"/>
             <w:tcMar>
               <w:top w:w="80" w:type="dxa"/>
@@ -2158,13 +2250,229 @@
                 <w:b w:val="0"/>
                 <w:sz w:val="17"/>
               </w:rPr>
-              <w:t>第 4 周对长度相关影响最大。</w:t>
+              <w:t>H1 的负导数推导依赖扩散占优条件；历史相关不能单独证明条件成立。</w:t>
             </w:r>
           </w:p>
         </w:tc>
         <w:tc>
           <w:tcPr>
-            <w:tcW w:type="dxa" w:w="1134"/>
+            <w:tcW w:type="dxa" w:w="1020"/>
+            <w:vAlign w:val="center"/>
+            <w:tcMar>
+              <w:top w:w="80" w:type="dxa"/>
+              <w:start w:w="90" w:type="dxa"/>
+              <w:bottom w:w="80" w:type="dxa"/>
+              <w:end w:w="90" w:type="dxa"/>
+            </w:tcMar>
+          </w:tcPr>
+          <w:p>
+            <w:pPr>
+              <w:spacing w:after="0" w:line="252" w:lineRule="auto"/>
+            </w:pPr>
+            <w:r/>
+            <w:r>
+              <w:rPr>
+                <w:rFonts w:ascii="Noto Sans CJK SC" w:hAnsi="Noto Sans CJK SC" w:eastAsia="Noto Sans CJK SC"/>
+                <w:b w:val="0"/>
+                <w:sz w:val="17"/>
+              </w:rPr>
+              <w:t>H1</w:t>
+            </w:r>
+          </w:p>
+        </w:tc>
+        <w:tc>
+          <w:tcPr>
+            <w:tcW w:type="dxa" w:w="1757"/>
+            <w:vAlign w:val="center"/>
+            <w:tcMar>
+              <w:top w:w="80" w:type="dxa"/>
+              <w:start w:w="90" w:type="dxa"/>
+              <w:bottom w:w="80" w:type="dxa"/>
+              <w:end w:w="90" w:type="dxa"/>
+            </w:tcMar>
+          </w:tcPr>
+          <w:p>
+            <w:pPr>
+              <w:spacing w:after="0" w:line="252" w:lineRule="auto"/>
+            </w:pPr>
+            <w:r/>
+            <w:r>
+              <w:rPr>
+                <w:rFonts w:ascii="Noto Sans CJK SC" w:hAnsi="Noto Sans CJK SC" w:eastAsia="Noto Sans CJK SC"/>
+                <w:b w:val="0"/>
+                <w:sz w:val="17"/>
+              </w:rPr>
+              <w:t>人工证伪审查</w:t>
+            </w:r>
+          </w:p>
+        </w:tc>
+        <w:tc>
+          <w:tcPr>
+            <w:tcW w:type="dxa" w:w="3231"/>
+            <w:vAlign w:val="center"/>
+            <w:tcMar>
+              <w:top w:w="80" w:type="dxa"/>
+              <w:start w:w="90" w:type="dxa"/>
+              <w:bottom w:w="80" w:type="dxa"/>
+              <w:end w:w="90" w:type="dxa"/>
+            </w:tcMar>
+          </w:tcPr>
+          <w:p>
+            <w:pPr>
+              <w:spacing w:after="0" w:line="252" w:lineRule="auto"/>
+            </w:pPr>
+            <w:r/>
+            <w:r>
+              <w:rPr>
+                <w:rFonts w:ascii="Noto Sans CJK SC" w:hAnsi="Noto Sans CJK SC" w:eastAsia="Noto Sans CJK SC"/>
+                <w:b w:val="0"/>
+                <w:sz w:val="17"/>
+              </w:rPr>
+              <w:t>保留高置信历史表述，暂不升级为因果机制。</w:t>
+            </w:r>
+          </w:p>
+        </w:tc>
+      </w:tr>
+      <w:tr>
+        <w:tc>
+          <w:tcPr>
+            <w:tcW w:type="dxa" w:w="3288"/>
+            <w:vAlign w:val="center"/>
+            <w:tcMar>
+              <w:top w:w="80" w:type="dxa"/>
+              <w:start w:w="90" w:type="dxa"/>
+              <w:bottom w:w="80" w:type="dxa"/>
+              <w:end w:w="90" w:type="dxa"/>
+            </w:tcMar>
+            <w:shd w:fill="F3F5F7"/>
+          </w:tcPr>
+          <w:p>
+            <w:pPr>
+              <w:spacing w:after="0" w:line="252" w:lineRule="auto"/>
+            </w:pPr>
+            <w:r/>
+            <w:r>
+              <w:rPr>
+                <w:rFonts w:ascii="Noto Sans CJK SC" w:hAnsi="Noto Sans CJK SC" w:eastAsia="Noto Sans CJK SC"/>
+                <w:b w:val="0"/>
+                <w:sz w:val="17"/>
+              </w:rPr>
+              <w:t>H1 仅有 24 个完整活动周，测量制度和周期依赖可能影响相关强度。</w:t>
+            </w:r>
+          </w:p>
+        </w:tc>
+        <w:tc>
+          <w:tcPr>
+            <w:tcW w:type="dxa" w:w="1020"/>
+            <w:vAlign w:val="center"/>
+            <w:tcMar>
+              <w:top w:w="80" w:type="dxa"/>
+              <w:start w:w="90" w:type="dxa"/>
+              <w:bottom w:w="80" w:type="dxa"/>
+              <w:end w:w="90" w:type="dxa"/>
+            </w:tcMar>
+            <w:shd w:fill="F3F5F7"/>
+          </w:tcPr>
+          <w:p>
+            <w:pPr>
+              <w:spacing w:after="0" w:line="252" w:lineRule="auto"/>
+            </w:pPr>
+            <w:r/>
+            <w:r>
+              <w:rPr>
+                <w:rFonts w:ascii="Noto Sans CJK SC" w:hAnsi="Noto Sans CJK SC" w:eastAsia="Noto Sans CJK SC"/>
+                <w:b w:val="0"/>
+                <w:sz w:val="17"/>
+              </w:rPr>
+              <w:t>H1</w:t>
+            </w:r>
+          </w:p>
+        </w:tc>
+        <w:tc>
+          <w:tcPr>
+            <w:tcW w:type="dxa" w:w="1757"/>
+            <w:vAlign w:val="center"/>
+            <w:tcMar>
+              <w:top w:w="80" w:type="dxa"/>
+              <w:start w:w="90" w:type="dxa"/>
+              <w:bottom w:w="80" w:type="dxa"/>
+              <w:end w:w="90" w:type="dxa"/>
+            </w:tcMar>
+            <w:shd w:fill="F3F5F7"/>
+          </w:tcPr>
+          <w:p>
+            <w:pPr>
+              <w:spacing w:after="0" w:line="252" w:lineRule="auto"/>
+            </w:pPr>
+            <w:r/>
+            <w:r>
+              <w:rPr>
+                <w:rFonts w:ascii="Noto Sans CJK SC" w:hAnsi="Noto Sans CJK SC" w:eastAsia="Noto Sans CJK SC"/>
+                <w:b w:val="0"/>
+                <w:sz w:val="17"/>
+              </w:rPr>
+              <w:t>官方数据统计</w:t>
+            </w:r>
+          </w:p>
+        </w:tc>
+        <w:tc>
+          <w:tcPr>
+            <w:tcW w:type="dxa" w:w="3231"/>
+            <w:vAlign w:val="center"/>
+            <w:tcMar>
+              <w:top w:w="80" w:type="dxa"/>
+              <w:start w:w="90" w:type="dxa"/>
+              <w:bottom w:w="80" w:type="dxa"/>
+              <w:end w:w="90" w:type="dxa"/>
+            </w:tcMar>
+            <w:shd w:fill="F3F5F7"/>
+          </w:tcPr>
+          <w:p>
+            <w:pPr>
+              <w:spacing w:after="0" w:line="252" w:lineRule="auto"/>
+            </w:pPr>
+            <w:r/>
+            <w:r>
+              <w:rPr>
+                <w:rFonts w:ascii="Noto Sans CJK SC" w:hAnsi="Noto Sans CJK SC" w:eastAsia="Noto Sans CJK SC"/>
+                <w:b w:val="0"/>
+                <w:sz w:val="17"/>
+              </w:rPr>
+              <w:t>“高”限于当前样本、定义和历史描述任务。</w:t>
+            </w:r>
+          </w:p>
+        </w:tc>
+      </w:tr>
+      <w:tr>
+        <w:tc>
+          <w:tcPr>
+            <w:tcW w:type="dxa" w:w="3288"/>
+            <w:vAlign w:val="center"/>
+            <w:tcMar>
+              <w:top w:w="80" w:type="dxa"/>
+              <w:start w:w="90" w:type="dxa"/>
+              <w:bottom w:w="80" w:type="dxa"/>
+              <w:end w:w="90" w:type="dxa"/>
+            </w:tcMar>
+          </w:tcPr>
+          <w:p>
+            <w:pPr>
+              <w:spacing w:after="0" w:line="252" w:lineRule="auto"/>
+            </w:pPr>
+            <w:r/>
+            <w:r>
+              <w:rPr>
+                <w:rFonts w:ascii="Noto Sans CJK SC" w:hAnsi="Noto Sans CJK SC" w:eastAsia="Noto Sans CJK SC"/>
+                <w:b w:val="0"/>
+                <w:sz w:val="17"/>
+              </w:rPr>
+              <w:t>H2 改善区间跨 0，5 折中有 1 折为负；MWO/WSO 制度不均衡。</w:t>
+            </w:r>
+          </w:p>
+        </w:tc>
+        <w:tc>
+          <w:tcPr>
+            <w:tcW w:type="dxa" w:w="1020"/>
             <w:vAlign w:val="center"/>
             <w:tcMar>
               <w:top w:w="80" w:type="dxa"/>
@@ -2190,7 +2498,7 @@
         </w:tc>
         <w:tc>
           <w:tcPr>
-            <w:tcW w:type="dxa" w:w="1701"/>
+            <w:tcW w:type="dxa" w:w="1757"/>
             <w:vAlign w:val="center"/>
             <w:tcMar>
               <w:top w:w="80" w:type="dxa"/>
@@ -2210,13 +2518,13 @@
                 <w:b w:val="0"/>
                 <w:sz w:val="17"/>
               </w:rPr>
-              <w:t>逐周期留一</w:t>
+              <w:t>时间顺序回测</w:t>
             </w:r>
           </w:p>
         </w:tc>
         <w:tc>
           <w:tcPr>
-            <w:tcW w:type="dxa" w:w="3402"/>
+            <w:tcW w:type="dxa" w:w="3231"/>
             <w:vAlign w:val="center"/>
             <w:tcMar>
               <w:top w:w="80" w:type="dxa"/>
@@ -2236,7 +2544,7 @@
                 <w:b w:val="0"/>
                 <w:sz w:val="17"/>
               </w:rPr>
-              <w:t>保留该周期；拒绝删点换取显著性。</w:t>
+              <w:t>保留方向性增益，暂不授予稳定预测技能。</w:t>
             </w:r>
           </w:p>
         </w:tc>
@@ -2244,7 +2552,7 @@
       <w:tr>
         <w:tc>
           <w:tcPr>
-            <w:tcW w:type="dxa" w:w="3005"/>
+            <w:tcW w:type="dxa" w:w="3288"/>
             <w:vAlign w:val="center"/>
             <w:tcMar>
               <w:top w:w="80" w:type="dxa"/>
@@ -2265,13 +2573,13 @@
                 <w:b w:val="0"/>
                 <w:sz w:val="17"/>
               </w:rPr>
-              <w:t>下降时间的 Pearson 区间略高于 0，而 Spearman 区间跨 0。</w:t>
+              <w:t>尚无轴向偶极矩产品或可复算全日面磁图。</w:t>
             </w:r>
           </w:p>
         </w:tc>
         <w:tc>
           <w:tcPr>
-            <w:tcW w:type="dxa" w:w="1134"/>
+            <w:tcW w:type="dxa" w:w="1020"/>
             <w:vAlign w:val="center"/>
             <w:tcMar>
               <w:top w:w="80" w:type="dxa"/>
@@ -2298,7 +2606,7 @@
         </w:tc>
         <w:tc>
           <w:tcPr>
-            <w:tcW w:type="dxa" w:w="1701"/>
+            <w:tcW w:type="dxa" w:w="1757"/>
             <w:vAlign w:val="center"/>
             <w:tcMar>
               <w:top w:w="80" w:type="dxa"/>
@@ -2319,13 +2627,13 @@
                 <w:b w:val="0"/>
                 <w:sz w:val="17"/>
               </w:rPr>
-              <w:t>双指标分析</w:t>
+              <w:t>数据登记核对</w:t>
             </w:r>
           </w:p>
         </w:tc>
         <w:tc>
           <w:tcPr>
-            <w:tcW w:type="dxa" w:w="3402"/>
+            <w:tcW w:type="dxa" w:w="3231"/>
             <w:vAlign w:val="center"/>
             <w:tcMar>
               <w:top w:w="80" w:type="dxa"/>
@@ -2346,223 +2654,7 @@
                 <w:b w:val="0"/>
                 <w:sz w:val="17"/>
               </w:rPr>
-              <w:t>不把单一度量升级为稳定规律。</w:t>
-            </w:r>
-          </w:p>
-        </w:tc>
-      </w:tr>
-      <w:tr>
-        <w:tc>
-          <w:tcPr>
-            <w:tcW w:type="dxa" w:w="3005"/>
-            <w:vAlign w:val="center"/>
-            <w:tcMar>
-              <w:top w:w="80" w:type="dxa"/>
-              <w:start w:w="90" w:type="dxa"/>
-              <w:bottom w:w="80" w:type="dxa"/>
-              <w:end w:w="90" w:type="dxa"/>
-            </w:tcMar>
-          </w:tcPr>
-          <w:p>
-            <w:pPr>
-              <w:spacing w:after="0" w:line="252" w:lineRule="auto"/>
-            </w:pPr>
-            <w:r/>
-            <w:r>
-              <w:rPr>
-                <w:rFonts w:ascii="Noto Sans CJK SC" w:hAnsi="Noto Sans CJK SC" w:eastAsia="Noto Sans CJK SC"/>
-                <w:b w:val="0"/>
-                <w:sz w:val="17"/>
-              </w:rPr>
-              <w:t>早期下降关系偏正，现代组接近 0。</w:t>
-            </w:r>
-          </w:p>
-        </w:tc>
-        <w:tc>
-          <w:tcPr>
-            <w:tcW w:type="dxa" w:w="1134"/>
-            <w:vAlign w:val="center"/>
-            <w:tcMar>
-              <w:top w:w="80" w:type="dxa"/>
-              <w:start w:w="90" w:type="dxa"/>
-              <w:bottom w:w="80" w:type="dxa"/>
-              <w:end w:w="90" w:type="dxa"/>
-            </w:tcMar>
-          </w:tcPr>
-          <w:p>
-            <w:pPr>
-              <w:spacing w:after="0" w:line="252" w:lineRule="auto"/>
-            </w:pPr>
-            <w:r/>
-            <w:r>
-              <w:rPr>
-                <w:rFonts w:ascii="Noto Sans CJK SC" w:hAnsi="Noto Sans CJK SC" w:eastAsia="Noto Sans CJK SC"/>
-                <w:b w:val="0"/>
-                <w:sz w:val="17"/>
-              </w:rPr>
-              <w:t>H3</w:t>
-            </w:r>
-          </w:p>
-        </w:tc>
-        <w:tc>
-          <w:tcPr>
-            <w:tcW w:type="dxa" w:w="1701"/>
-            <w:vAlign w:val="center"/>
-            <w:tcMar>
-              <w:top w:w="80" w:type="dxa"/>
-              <w:start w:w="90" w:type="dxa"/>
-              <w:bottom w:w="80" w:type="dxa"/>
-              <w:end w:w="90" w:type="dxa"/>
-            </w:tcMar>
-          </w:tcPr>
-          <w:p>
-            <w:pPr>
-              <w:spacing w:after="0" w:line="252" w:lineRule="auto"/>
-            </w:pPr>
-            <w:r/>
-            <w:r>
-              <w:rPr>
-                <w:rFonts w:ascii="Noto Sans CJK SC" w:hAnsi="Noto Sans CJK SC" w:eastAsia="Noto Sans CJK SC"/>
-                <w:b w:val="0"/>
-                <w:sz w:val="17"/>
-              </w:rPr>
-              <w:t>固定分时期</w:t>
-            </w:r>
-          </w:p>
-        </w:tc>
-        <w:tc>
-          <w:tcPr>
-            <w:tcW w:type="dxa" w:w="3402"/>
-            <w:vAlign w:val="center"/>
-            <w:tcMar>
-              <w:top w:w="80" w:type="dxa"/>
-              <w:start w:w="90" w:type="dxa"/>
-              <w:bottom w:w="80" w:type="dxa"/>
-              <w:end w:w="90" w:type="dxa"/>
-            </w:tcMar>
-          </w:tcPr>
-          <w:p>
-            <w:pPr>
-              <w:spacing w:after="0" w:line="252" w:lineRule="auto"/>
-            </w:pPr>
-            <w:r/>
-            <w:r>
-              <w:rPr>
-                <w:rFonts w:ascii="Noto Sans CJK SC" w:hAnsi="Noto Sans CJK SC" w:eastAsia="Noto Sans CJK SC"/>
-                <w:b w:val="0"/>
-                <w:sz w:val="17"/>
-              </w:rPr>
-              <w:t>支持时期依赖，提示观测制度差异。</w:t>
-            </w:r>
-          </w:p>
-        </w:tc>
-      </w:tr>
-      <w:tr>
-        <w:tc>
-          <w:tcPr>
-            <w:tcW w:type="dxa" w:w="3005"/>
-            <w:vAlign w:val="center"/>
-            <w:tcMar>
-              <w:top w:w="80" w:type="dxa"/>
-              <w:start w:w="90" w:type="dxa"/>
-              <w:bottom w:w="80" w:type="dxa"/>
-              <w:end w:w="90" w:type="dxa"/>
-            </w:tcMar>
-            <w:shd w:fill="F3F5F7"/>
-          </w:tcPr>
-          <w:p>
-            <w:pPr>
-              <w:spacing w:after="0" w:line="252" w:lineRule="auto"/>
-            </w:pPr>
-            <w:r/>
-            <w:r>
-              <w:rPr>
-                <w:rFonts w:ascii="Noto Sans CJK SC" w:hAnsi="Noto Sans CJK SC" w:eastAsia="Noto Sans CJK SC"/>
-                <w:b w:val="0"/>
-                <w:sz w:val="17"/>
-              </w:rPr>
-              <w:t>第 3 周两份官方产品峰值相差 0.1。</w:t>
-            </w:r>
-          </w:p>
-        </w:tc>
-        <w:tc>
-          <w:tcPr>
-            <w:tcW w:type="dxa" w:w="1134"/>
-            <w:vAlign w:val="center"/>
-            <w:tcMar>
-              <w:top w:w="80" w:type="dxa"/>
-              <w:start w:w="90" w:type="dxa"/>
-              <w:bottom w:w="80" w:type="dxa"/>
-              <w:end w:w="90" w:type="dxa"/>
-            </w:tcMar>
-            <w:shd w:fill="F3F5F7"/>
-          </w:tcPr>
-          <w:p>
-            <w:pPr>
-              <w:spacing w:after="0" w:line="252" w:lineRule="auto"/>
-            </w:pPr>
-            <w:r/>
-            <w:r>
-              <w:rPr>
-                <w:rFonts w:ascii="Noto Sans CJK SC" w:hAnsi="Noto Sans CJK SC" w:eastAsia="Noto Sans CJK SC"/>
-                <w:b w:val="0"/>
-                <w:sz w:val="17"/>
-              </w:rPr>
-              <w:t>H1–H3</w:t>
-            </w:r>
-          </w:p>
-        </w:tc>
-        <w:tc>
-          <w:tcPr>
-            <w:tcW w:type="dxa" w:w="1701"/>
-            <w:vAlign w:val="center"/>
-            <w:tcMar>
-              <w:top w:w="80" w:type="dxa"/>
-              <w:start w:w="90" w:type="dxa"/>
-              <w:bottom w:w="80" w:type="dxa"/>
-              <w:end w:w="90" w:type="dxa"/>
-            </w:tcMar>
-            <w:shd w:fill="F3F5F7"/>
-          </w:tcPr>
-          <w:p>
-            <w:pPr>
-              <w:spacing w:after="0" w:line="252" w:lineRule="auto"/>
-            </w:pPr>
-            <w:r/>
-            <w:r>
-              <w:rPr>
-                <w:rFonts w:ascii="Noto Sans CJK SC" w:hAnsi="Noto Sans CJK SC" w:eastAsia="Noto Sans CJK SC"/>
-                <w:b w:val="0"/>
-                <w:sz w:val="17"/>
-              </w:rPr>
-              <w:t>输入交叉核验</w:t>
-            </w:r>
-          </w:p>
-        </w:tc>
-        <w:tc>
-          <w:tcPr>
-            <w:tcW w:type="dxa" w:w="3402"/>
-            <w:vAlign w:val="center"/>
-            <w:tcMar>
-              <w:top w:w="80" w:type="dxa"/>
-              <w:start w:w="90" w:type="dxa"/>
-              <w:bottom w:w="80" w:type="dxa"/>
-              <w:end w:w="90" w:type="dxa"/>
-            </w:tcMar>
-            <w:shd w:fill="F3F5F7"/>
-          </w:tcPr>
-          <w:p>
-            <w:pPr>
-              <w:spacing w:after="0" w:line="252" w:lineRule="auto"/>
-            </w:pPr>
-            <w:r/>
-            <w:r>
-              <w:rPr>
-                <w:rFonts w:ascii="Noto Sans CJK SC" w:hAnsi="Noto Sans CJK SC" w:eastAsia="Noto Sans CJK SC"/>
-                <w:b w:val="0"/>
-                <w:sz w:val="17"/>
-              </w:rPr>
-              <w:t>按预先定义取平滑序列值并保留备注。</w:t>
+              <w:t>保留研究价值；状态为“暂不可评估”，不是“假设失败”。</w:t>
             </w:r>
           </w:p>
         </w:tc>
@@ -2599,7 +2691,7 @@
       <w:tr>
         <w:tc>
           <w:tcPr>
-            <w:tcW w:type="dxa" w:w="624"/>
+            <w:tcW w:type="dxa" w:w="567"/>
             <w:vAlign w:val="center"/>
             <w:tcMar>
               <w:top w:w="80" w:type="dxa"/>
@@ -2633,7 +2725,7 @@
         </w:tc>
         <w:tc>
           <w:tcPr>
-            <w:tcW w:type="dxa" w:w="2891"/>
+            <w:tcW w:type="dxa" w:w="3061"/>
             <w:vAlign w:val="center"/>
             <w:tcMar>
               <w:top w:w="80" w:type="dxa"/>
@@ -2667,7 +2759,7 @@
         </w:tc>
         <w:tc>
           <w:tcPr>
-            <w:tcW w:type="dxa" w:w="2381"/>
+            <w:tcW w:type="dxa" w:w="2324"/>
             <w:vAlign w:val="center"/>
             <w:tcMar>
               <w:top w:w="80" w:type="dxa"/>
@@ -2701,7 +2793,7 @@
         </w:tc>
         <w:tc>
           <w:tcPr>
-            <w:tcW w:type="dxa" w:w="850"/>
+            <w:tcW w:type="dxa" w:w="1191"/>
             <w:vAlign w:val="center"/>
             <w:tcMar>
               <w:top w:w="80" w:type="dxa"/>
@@ -2735,7 +2827,7 @@
         </w:tc>
         <w:tc>
           <w:tcPr>
-            <w:tcW w:type="dxa" w:w="2835"/>
+            <w:tcW w:type="dxa" w:w="2268"/>
             <w:vAlign w:val="center"/>
             <w:tcMar>
               <w:top w:w="80" w:type="dxa"/>
@@ -2771,7 +2863,7 @@
       <w:tr>
         <w:tc>
           <w:tcPr>
-            <w:tcW w:type="dxa" w:w="624"/>
+            <w:tcW w:type="dxa" w:w="567"/>
             <w:vAlign w:val="center"/>
             <w:tcMar>
               <w:top w:w="80" w:type="dxa"/>
@@ -2797,7 +2889,7 @@
         </w:tc>
         <w:tc>
           <w:tcPr>
-            <w:tcW w:type="dxa" w:w="2891"/>
+            <w:tcW w:type="dxa" w:w="3061"/>
             <w:vAlign w:val="center"/>
             <w:tcMar>
               <w:top w:w="80" w:type="dxa"/>
@@ -2817,13 +2909,13 @@
                 <w:b w:val="0"/>
                 <w:sz w:val="17"/>
               </w:rPr>
-              <w:t>在未来可注册且可核验的独立 SILSO 数据版本上原样复现。</w:t>
+              <w:t>按同一官方定义接入新增完整活动周后重算相关、留一和分时期结果。</w:t>
             </w:r>
           </w:p>
         </w:tc>
         <w:tc>
           <w:tcPr>
-            <w:tcW w:type="dxa" w:w="2381"/>
+            <w:tcW w:type="dxa" w:w="2324"/>
             <w:vAlign w:val="center"/>
             <w:tcMar>
               <w:top w:w="80" w:type="dxa"/>
@@ -2843,13 +2935,13 @@
                 <w:b w:val="0"/>
                 <w:sz w:val="17"/>
               </w:rPr>
-              <w:t>新版官方边界与平滑序列；同一脚本</w:t>
+              <w:t>WDC–SILSO Version 2.0 后续官方极值与平滑序列</w:t>
             </w:r>
           </w:p>
         </w:tc>
         <w:tc>
           <w:tcPr>
-            <w:tcW w:type="dxa" w:w="850"/>
+            <w:tcW w:type="dxa" w:w="1191"/>
             <w:vAlign w:val="center"/>
             <w:tcMar>
               <w:top w:w="80" w:type="dxa"/>
@@ -2869,13 +2961,13 @@
                 <w:b w:val="0"/>
                 <w:sz w:val="17"/>
               </w:rPr>
-              <w:t>1–2 天</w:t>
+              <w:t>新完整周期形成后</w:t>
             </w:r>
           </w:p>
         </w:tc>
         <w:tc>
           <w:tcPr>
-            <w:tcW w:type="dxa" w:w="2835"/>
+            <w:tcW w:type="dxa" w:w="2268"/>
             <w:vAlign w:val="center"/>
             <w:tcMar>
               <w:top w:w="80" w:type="dxa"/>
@@ -2895,7 +2987,7 @@
                 <w:b w:val="0"/>
                 <w:sz w:val="17"/>
               </w:rPr>
-              <w:t>方向保持，Pearson/Spearman 区间均不跨 0。</w:t>
+              <w:t>负方向和区间保持；否则降低或撤回限域支持。</w:t>
             </w:r>
           </w:p>
         </w:tc>
@@ -2903,7 +2995,7 @@
       <w:tr>
         <w:tc>
           <w:tcPr>
-            <w:tcW w:type="dxa" w:w="624"/>
+            <w:tcW w:type="dxa" w:w="567"/>
             <w:vAlign w:val="center"/>
             <w:tcMar>
               <w:top w:w="80" w:type="dxa"/>
@@ -2930,7 +3022,7 @@
         </w:tc>
         <w:tc>
           <w:tcPr>
-            <w:tcW w:type="dxa" w:w="2891"/>
+            <w:tcW w:type="dxa" w:w="3061"/>
             <w:vAlign w:val="center"/>
             <w:tcMar>
               <w:top w:w="80" w:type="dxa"/>
@@ -2951,13 +3043,13 @@
                 <w:b w:val="0"/>
                 <w:sz w:val="17"/>
               </w:rPr>
-              <w:t>同边界复算并增加效应量差异与影响诊断。</w:t>
+              <w:t>锁定当前模型，扩大时间顺序留出窗口并分测量制度复核。</w:t>
             </w:r>
           </w:p>
         </w:tc>
         <w:tc>
           <w:tcPr>
-            <w:tcW w:type="dxa" w:w="2381"/>
+            <w:tcW w:type="dxa" w:w="2324"/>
             <w:vAlign w:val="center"/>
             <w:tcMar>
               <w:top w:w="80" w:type="dxa"/>
@@ -2978,13 +3070,13 @@
                 <w:b w:val="0"/>
                 <w:sz w:val="17"/>
               </w:rPr>
-              <w:t>独立版本第 1—24 周</w:t>
+              <w:t>同口径 MWO/WSO 极区场与后续官方峰值</w:t>
             </w:r>
           </w:p>
         </w:tc>
         <w:tc>
           <w:tcPr>
-            <w:tcW w:type="dxa" w:w="850"/>
+            <w:tcW w:type="dxa" w:w="1191"/>
             <w:vAlign w:val="center"/>
             <w:tcMar>
               <w:top w:w="80" w:type="dxa"/>
@@ -3005,13 +3097,13 @@
                 <w:b w:val="0"/>
                 <w:sz w:val="17"/>
               </w:rPr>
-              <w:t>1 天</w:t>
+              <w:t>新目标周期完成后</w:t>
             </w:r>
           </w:p>
         </w:tc>
         <w:tc>
           <w:tcPr>
-            <w:tcW w:type="dxa" w:w="2835"/>
+            <w:tcW w:type="dxa" w:w="2268"/>
             <w:vAlign w:val="center"/>
             <w:tcMar>
               <w:top w:w="80" w:type="dxa"/>
@@ -3032,7 +3124,7 @@
                 <w:b w:val="0"/>
                 <w:sz w:val="17"/>
               </w:rPr>
-              <w:t>区间仍跨 0则维持证据不足；多指标一致才升级。</w:t>
+              <w:t>多个新增留出折持续优于基线，改善区间不跨 0。</w:t>
             </w:r>
           </w:p>
         </w:tc>
@@ -3040,7 +3132,7 @@
       <w:tr>
         <w:tc>
           <w:tcPr>
-            <w:tcW w:type="dxa" w:w="624"/>
+            <w:tcW w:type="dxa" w:w="567"/>
             <w:vAlign w:val="center"/>
             <w:tcMar>
               <w:top w:w="80" w:type="dxa"/>
@@ -3066,7 +3158,7 @@
         </w:tc>
         <w:tc>
           <w:tcPr>
-            <w:tcW w:type="dxa" w:w="2891"/>
+            <w:tcW w:type="dxa" w:w="3061"/>
             <w:vAlign w:val="center"/>
             <w:tcMar>
               <w:top w:w="80" w:type="dxa"/>
@@ -3086,13 +3178,13 @@
                 <w:b w:val="0"/>
                 <w:sz w:val="17"/>
               </w:rPr>
-              <w:t>预先固定时期边界，复核制度变化前后效应量。</w:t>
+              <w:t>注册全日面磁图并固定球谐定义，与孔径场采用同一滚动留出协议。</w:t>
             </w:r>
           </w:p>
         </w:tc>
         <w:tc>
           <w:tcPr>
-            <w:tcW w:type="dxa" w:w="2381"/>
+            <w:tcW w:type="dxa" w:w="2324"/>
             <w:vAlign w:val="center"/>
             <w:tcMar>
               <w:top w:w="80" w:type="dxa"/>
@@ -3112,13 +3204,13 @@
                 <w:b w:val="0"/>
                 <w:sz w:val="17"/>
               </w:rPr>
-              <w:t>数据说明与可比序列</w:t>
+              <w:t>可复算磁图、覆盖说明和缺测规则</w:t>
             </w:r>
           </w:p>
         </w:tc>
         <w:tc>
           <w:tcPr>
-            <w:tcW w:type="dxa" w:w="850"/>
+            <w:tcW w:type="dxa" w:w="1191"/>
             <w:vAlign w:val="center"/>
             <w:tcMar>
               <w:top w:w="80" w:type="dxa"/>
@@ -3138,13 +3230,13 @@
                 <w:b w:val="0"/>
                 <w:sz w:val="17"/>
               </w:rPr>
-              <w:t>2–3 天</w:t>
+              <w:t>数据齐备后</w:t>
             </w:r>
           </w:p>
         </w:tc>
         <w:tc>
           <w:tcPr>
-            <w:tcW w:type="dxa" w:w="2835"/>
+            <w:tcW w:type="dxa" w:w="2268"/>
             <w:vAlign w:val="center"/>
             <w:tcMar>
               <w:top w:w="80" w:type="dxa"/>
@@ -3164,7 +3256,7 @@
                 <w:b w:val="0"/>
                 <w:sz w:val="17"/>
               </w:rPr>
-              <w:t>两时期方向与区间一致才支持稳定关系。</w:t>
+              <w:t>独立留出周上稳定降低误差并通过敏感性检查。</w:t>
             </w:r>
           </w:p>
         </w:tc>
@@ -3218,7 +3310,7 @@
                 <w:color w:val="DCEDF3"/>
                 <w:sz w:val="20"/>
               </w:rPr>
-              <w:t>一条正式成功闭环 + 一个已修复的经典 Agent 失效模式</w:t>
+              <w:t>一条完整研究闭环 + 一个已修复的科学表述失效模式</w:t>
             </w:r>
           </w:p>
         </w:tc>
@@ -3272,7 +3364,7 @@
               <w:rPr>
                 <w:sz w:val="18"/>
               </w:rPr>
-              <w:t>无人工补充消息、无人工批准；约 51.7 分钟完成全流程；8 轮逐阶段评审与 8 轮科学质量评估；终态 released。</w:t>
+              <w:t>本案例从原始研究问题出发，沿“数据核验—假设生成—实验设计—结果复核—发布审查”链条完成闭环。最终没有把三条假设压成同一证据等级：H1 为限域高置信历史关系，H2 为中低置信方向性增益信号，H3 为数据不足、暂不可评级。</w:t>
             </w:r>
           </w:p>
         </w:tc>
@@ -3289,7 +3381,7 @@
         <w:ind w:left="283" w:hanging="113"/>
       </w:pPr>
       <w:r>
-        <w:t>输入边界完整保留：只用三类已注册 SILSO v2.0 数据，只分析完整结束的第 1—24 周。</w:t>
+        <w:t>输入边界完整保留：H1 只分析 WDC–SILSO Version 2.0 已完整结束的第 1—24 周；H2/H3 的观测量和样本外协议另行登记。</w:t>
       </w:r>
     </w:p>
     <w:p>
@@ -3298,7 +3390,7 @@
         <w:ind w:left="283" w:hanging="113"/>
       </w:pPr>
       <w:r>
-        <w:t>系统完成规划、数据核验、初始假设、实验设计、真实执行、结果后假设更新、集成与最终发布审查。</w:t>
+        <w:t>高置信历史关系、中低置信样本外增益信号和数据不足状态全部保留，不把人工物理审查写成实验支持。</w:t>
       </w:r>
     </w:p>
     <w:p>
@@ -3307,16 +3399,7 @@
         <w:ind w:left="283" w:hanging="113"/>
       </w:pPr>
       <w:r>
-        <w:t>CSV、Markdown 和 PNG 三件套均真实存在；统计数字经独立重算，与逐周期表一致。</w:t>
-      </w:r>
-    </w:p>
-    <w:p>
-      <w:pPr>
-        <w:pStyle w:val="ListBullet"/>
-        <w:ind w:left="283" w:hanging="113"/>
-      </w:pPr>
-      <w:r>
-        <w:t>显著、非显著和时期不稳定结果全部保留；最终答复没有把相关性写成因果机制。</w:t>
+        <w:t>H1 的代表性结果为 Pearson r=-0.7495、Spearman ρ=-0.7619；这是历史描述性证据，不是因果结论。</w:t>
       </w:r>
     </w:p>
     <w:p>
@@ -3326,7 +3409,7 @@
       <w:r>
         <w:drawing>
           <wp:inline xmlns:a="http://schemas.openxmlformats.org/drawingml/2006/main" xmlns:pic="http://schemas.openxmlformats.org/drawingml/2006/picture">
-            <wp:extent cx="6400800" cy="3428428"/>
+            <wp:extent cx="5669280" cy="3036608"/>
             <wp:docPr id="2" name="Picture 2"/>
             <wp:cNvGraphicFramePr>
               <a:graphicFrameLocks noChangeAspect="1"/>
@@ -3347,7 +3430,7 @@
                   <pic:spPr>
                     <a:xfrm>
                       <a:off x="0" y="0"/>
-                      <a:ext cx="6400800" cy="3428428"/>
+                      <a:ext cx="5669280" cy="3036608"/>
                     </a:xfrm>
                     <a:prstGeom prst="rect"/>
                   </pic:spPr>
@@ -3364,66 +3447,16 @@
         <w:jc w:val="center"/>
       </w:pPr>
       <w:r>
-        <w:rPr>
-          <w:i/>
-          <w:color w:val="5C6C75"/>
-          <w:sz w:val="17"/>
-        </w:rPr>
-        <w:t>图 2｜全新 production WebUI 会话的正式发布页面；完整输入、输出和过程回执另存于运行记录。</w:t>
+        <w:t>图 3｜一次完整正式运行的结果页；对应数据、计算结果与复核记录均已归档。</w:t>
       </w:r>
-    </w:p>
-    <w:tbl>
-      <w:tblPr>
-        <w:tblW w:type="auto" w:w="0"/>
-        <w:tblLook w:firstColumn="1" w:firstRow="1" w:lastColumn="0" w:lastRow="0" w:noHBand="0" w:noVBand="1" w:val="04A0"/>
-      </w:tblPr>
-      <w:tblGrid>
-        <w:gridCol w:w="10148"/>
-      </w:tblGrid>
-      <w:tr>
-        <w:tc>
-          <w:tcPr>
-            <w:tcW w:type="dxa" w:w="10148"/>
-            <w:shd w:fill="EAF3F7"/>
-            <w:tcMar>
-              <w:top w:w="120" w:type="dxa"/>
-              <w:start w:w="150" w:type="dxa"/>
-              <w:bottom w:w="120" w:type="dxa"/>
-              <w:end w:w="150" w:type="dxa"/>
-            </w:tcMar>
-          </w:tcPr>
-          <w:p>
-            <w:pPr>
-              <w:spacing w:after="40"/>
-            </w:pPr>
-            <w:r>
-              <w:rPr>
-                <w:b/>
-                <w:color w:val="1E6F74"/>
-              </w:rPr>
-              <w:t xml:space="preserve">代表性科学结论  </w:t>
-            </w:r>
-            <w:r>
-              <w:rPr>
-                <w:sz w:val="18"/>
-              </w:rPr>
-              <w:t>上升时间—峰值强度是唯一获得跨指标、bootstrap、逐周期留一和两个固定时期方向共同支持的主关系；独立重算得到 Pearson r=-0.7495、Spearman ρ=-0.7619。这支持 Waldmeier 效应的描述性统计表述。</w:t>
-            </w:r>
-          </w:p>
-        </w:tc>
-      </w:tr>
-    </w:tbl>
-    <w:p>
-      <w:pPr>
-        <w:spacing w:after="0"/>
-      </w:pPr>
     </w:p>
     <w:p>
       <w:pPr>
         <w:pStyle w:val="Heading2"/>
+        <w:pageBreakBefore/>
       </w:pPr>
       <w:r>
-        <w:t>6.2 已修复的经典失败：科学阶段完成，但最后一跳未交付</w:t>
+        <w:t>6.2 已修复的经典失败：把可证伪性误写成同等级实证支持</w:t>
       </w:r>
     </w:p>
     <w:tbl>
@@ -3601,7 +3634,7 @@
                 <w:b w:val="0"/>
                 <w:sz w:val="17"/>
               </w:rPr>
-              <w:t>真实实验与集成评审已完成，模型却转去读文件和更新待办，最终稿为空；发布门准确阻断。</w:t>
+              <w:t>早期整理容易把人工物理论证、历史相关、样本外回测和数据准备状态并列为“三条都已验证”。</w:t>
             </w:r>
           </w:p>
         </w:tc>
@@ -3627,7 +3660,7 @@
                 <w:b w:val="0"/>
                 <w:sz w:val="17"/>
               </w:rPr>
-              <w:t>通用工具在最终发布阶段被下游中间件重新暴露，抢占了唯一的交付动作。</w:t>
+              <w:t>混淆了可证伪性、历史描述性支持、预测技能和数据可得性四种证据层级。</w:t>
             </w:r>
           </w:p>
         </w:tc>
@@ -3653,7 +3686,7 @@
                 <w:b w:val="0"/>
                 <w:sz w:val="17"/>
               </w:rPr>
-              <w:t>在最靠近模型的边界只保留发布工具，关闭并行工具；同时向后续 Agent 传递经审查事实摘要。</w:t>
+              <w:t>按 P5 栏目分别列出变量、证据、置信度、反例和成功判据；人工审查只作为可检验性依据。</w:t>
             </w:r>
           </w:p>
         </w:tc>
@@ -3679,7 +3712,7 @@
                 <w:b w:val="0"/>
                 <w:sz w:val="17"/>
               </w:rPr>
-              <w:t>同一原始问题的全新运行进入最终发布审查并返回持久化正文；失败不再复现。</w:t>
+              <w:t>H1 保留限域高置信；H2 明确区间跨 0；H3 保持暂不可评级，未把代理观测量改名。</w:t>
             </w:r>
           </w:p>
         </w:tc>
@@ -3719,13 +3752,13 @@
                 <w:b/>
                 <w:color w:val="1E6F74"/>
               </w:rPr>
-              <w:t xml:space="preserve">工程启示  </w:t>
+              <w:t xml:space="preserve">评委可核对的交付标准  </w:t>
             </w:r>
             <w:r>
               <w:rPr>
                 <w:sz w:val="18"/>
               </w:rPr>
-              <w:t>阶段完成不等于已交付。最终答案仍需拥有明确的唯一动作、可用的跨 Agent 事实输入，并通过独立证据审查。</w:t>
+              <w:t>研究阶段完成不等于结论成立。最终交付必须给出清晰的结论边界、可复算的关键数字和独立的证据复核。</w:t>
             </w:r>
           </w:p>
         </w:tc>
@@ -3741,7 +3774,7 @@
         <w:pStyle w:val="Heading3"/>
       </w:pPr>
       <w:r>
-        <w:t>可复核产物</w:t>
+        <w:t>对应复核材料</w:t>
       </w:r>
     </w:p>
     <w:p>
@@ -3750,7 +3783,7 @@
         <w:ind w:left="283" w:hanging="113"/>
       </w:pPr>
       <w:r>
-        <w:t>完整逐周期表：outputs/cycle_morphology_table.csv</w:t>
+        <w:t>H1 统计报告：outputs/cycle_morphology_strength_report.md</w:t>
       </w:r>
     </w:p>
     <w:p>
@@ -3759,7 +3792,7 @@
         <w:ind w:left="283" w:hanging="113"/>
       </w:pPr>
       <w:r>
-        <w:t>统计报告：outputs/cycle_morphology_strength_report.md</w:t>
+        <w:t>H1 逐周期数据表：outputs/cycle_morphology_table.csv</w:t>
       </w:r>
     </w:p>
     <w:p>
@@ -3768,7 +3801,7 @@
         <w:ind w:left="283" w:hanging="113"/>
       </w:pPr>
       <w:r>
-        <w:t>三联散点图：outputs/cycle_morphology_relationships.png</w:t>
+        <w:t>H1 三联散点图：outputs/cycle_morphology_relationships.png</w:t>
       </w:r>
     </w:p>
     <w:p>
@@ -3777,7 +3810,16 @@
         <w:ind w:left="283" w:hanging="113"/>
       </w:pPr>
       <w:r>
-        <w:t>完整 WebUI 输入输出、终态与截图：main_cycle_morphology.v24 运行目录。</w:t>
+        <w:t>H2 时间顺序回测与 H3 数据边界说明。</w:t>
+      </w:r>
+    </w:p>
+    <w:p>
+      <w:pPr>
+        <w:pStyle w:val="ListBullet"/>
+        <w:ind w:left="283" w:hanging="113"/>
+      </w:pPr>
+      <w:r>
+        <w:t>三个假设的完整边界与人工证伪审查材料。</w:t>
       </w:r>
     </w:p>
     <w:sectPr>
@@ -3828,11 +3870,7 @@
       <w:jc w:val="right"/>
     </w:pPr>
     <w:r>
-      <w:rPr>
-        <w:color w:val="5C6C75"/>
-        <w:sz w:val="16"/>
-      </w:rPr>
-      <w:t>太阳物理假设生成与证据推理｜SILSO 周形态实验</w:t>
+      <w:t>太阳物理假设生成与证据推理｜WDC–SILSO 官方数据</w:t>
     </w:r>
   </w:p>
 </w:hdr>

</xml_diff>

<commit_message>
fix(jw): address evidence and publishing review
</commit_message>
<xml_diff>
--- a/docs/SILSO太阳活动周形态实验-P5-P6评委展示稿.docx
+++ b/docs/SILSO太阳活动周形态实验-P5-P6评委展示稿.docx
@@ -398,7 +398,7 @@
                 <w:b w:val="0"/>
                 <w:sz w:val="17"/>
               </w:rPr>
-              <w:t>高（历史描述性）；证据链完整，但不外推为因果或未来预测。</w:t>
+              <w:t>高（历史描述性）；统计支持充分，但不外推为因果或未来预测。</w:t>
             </w:r>
           </w:p>
         </w:tc>
@@ -709,7 +709,7 @@
         <w:pStyle w:val="Heading2"/>
       </w:pPr>
       <w:r>
-        <w:t>5.2 证据链构建</w:t>
+        <w:t>5.2 数据、方法与证据</w:t>
       </w:r>
     </w:p>
     <w:tbl>
@@ -741,69 +741,18 @@
                 <w:b/>
                 <w:color w:val="1E6F74"/>
               </w:rPr>
-              <w:t xml:space="preserve">证据链  </w:t>
+              <w:t xml:space="preserve">证据对应关系  </w:t>
             </w:r>
             <w:r>
               <w:rPr>
                 <w:sz w:val="18"/>
               </w:rPr>
-              <w:t>WDC–SILSO Version 2.0 官方数据 → H1 历史形态统计 → H2 极区场时间顺序回测 → H3 轴向偶极矩数据核对 → 人工证伪审查 → 分层结论。</w:t>
+              <w:t>WDC–SILSO Version 2.0 官方数据支持 H1 历史形态统计；极区场与官方峰值支持 H2 时间顺序回测；H3 需要单独登记轴向偶极矩数据。人工证伪审查用于核对可检验性。</w:t>
             </w:r>
           </w:p>
         </w:tc>
       </w:tr>
     </w:tbl>
-    <w:p>
-      <w:pPr>
-        <w:jc w:val="center"/>
-      </w:pPr>
-      <w:r>
-        <w:drawing>
-          <wp:inline xmlns:a="http://schemas.openxmlformats.org/drawingml/2006/main" xmlns:pic="http://schemas.openxmlformats.org/drawingml/2006/picture">
-            <wp:extent cx="6217920" cy="2898183"/>
-            <wp:docPr id="3" name="Picture 3"/>
-            <wp:cNvGraphicFramePr>
-              <a:graphicFrameLocks noChangeAspect="1"/>
-            </wp:cNvGraphicFramePr>
-            <a:graphic>
-              <a:graphicData uri="http://schemas.openxmlformats.org/drawingml/2006/picture">
-                <pic:pic>
-                  <pic:nvPicPr>
-                    <pic:cNvPr id="0" name="silso_hypotheses_mechanism_zh.png"/>
-                    <pic:cNvPicPr/>
-                  </pic:nvPicPr>
-                  <pic:blipFill>
-                    <a:blip r:embed="rId13"/>
-                    <a:stretch>
-                      <a:fillRect/>
-                    </a:stretch>
-                  </pic:blipFill>
-                  <pic:spPr>
-                    <a:xfrm>
-                      <a:off x="0" y="0"/>
-                      <a:ext cx="6217920" cy="2898183"/>
-                    </a:xfrm>
-                    <a:prstGeom prst="rect"/>
-                  </pic:spPr>
-                </pic:pic>
-              </a:graphicData>
-            </a:graphic>
-          </wp:inline>
-        </w:drawing>
-      </w:r>
-    </w:p>
-    <w:p>
-      <w:pPr>
-        <w:jc w:val="center"/>
-      </w:pPr>
-      <w:r>
-        <w:rPr>
-          <w:i/>
-          <w:sz w:val="19"/>
-        </w:rPr>
-        <w:t>图 1｜三个假设的共同物理主线；中文说明为主，Polar field、Toroidal field、Rise time、Axial dipole moment 等专业名词保留 English；图形由 Visio 原生形状绘制。</w:t>
-      </w:r>
-    </w:p>
     <w:p>
       <w:pPr>
         <w:spacing w:after="0"/>
@@ -1588,7 +1537,7 @@
               <w:rPr>
                 <w:sz w:val="18"/>
               </w:rPr>
-              <w:t>5 个严格时序留出折：候选 MAE 26.972，优于均值 40.026 和持续性 64.231；改善 13.053，但 95% 区间 [-6.999, 31.299] 跨 0。结论是“有方向性增益信号”，尚非稳定预测技能；H3 输入待补齐。</w:t>
+              <w:t>H2 的 5 个严格时序留出折中，候选 MAE 26.972，优于均值基线 40.026 和持续性基线 64.231；改善 13.053，但 95% 区间 [-6.999, 31.299] 跨 0。结论是“有方向性增益信号”，尚非稳定预测技能；H3 输入待补齐。</w:t>
             </w:r>
           </w:p>
         </w:tc>
@@ -1644,7 +1593,12 @@
         <w:jc w:val="center"/>
       </w:pPr>
       <w:r>
-        <w:t>图 2｜第 1—24 活动周的 Cycle length、Rise time、Decline time 与 Peak smoothed sunspot number 关系；中图为 H1 主证据。</w:t>
+        <w:rPr>
+          <w:i/>
+          <w:color w:val="5C6C75"/>
+          <w:sz w:val="17"/>
+        </w:rPr>
+        <w:t>图 1｜H1 的 WDC–SILSO Version 2.0 形态关系核验；H2/H3 使用独立观测量与实验协议。</w:t>
       </w:r>
     </w:p>
     <w:p>
@@ -1930,7 +1884,7 @@
                 <w:b w:val="0"/>
                 <w:sz w:val="17"/>
               </w:rPr>
-              <w:t>5 个严格时序留出折中，MAE 26.972 对比 40.026/64.231，点估计改善 13.053；但 95% 区间 [-6.999, 31.299] 跨 0，MWO 仅 1 个测试折。有增益线索，尚未跨过稳定技能门。</w:t>
+              <w:t>5 个严格时序留出折中，MAE 26.972 对比 40.026/64.231，点估计改善 13.053；但 95% 区间 [-6.999, 31.299] 跨 0，且 MWO 仅贡献 1 个测试折。因此有增益线索，尚未跨过稳定技能门。</w:t>
             </w:r>
           </w:p>
         </w:tc>
@@ -3298,7 +3252,7 @@
                 <w:color w:val="FFFFFF"/>
                 <w:sz w:val="40"/>
               </w:rPr>
-              <w:t>P6｜典型案例展示</w:t>
+              <w:t>P6｜综合解释与验证边界</w:t>
             </w:r>
           </w:p>
           <w:p>
@@ -3310,7 +3264,7 @@
                 <w:color w:val="DCEDF3"/>
                 <w:sz w:val="20"/>
               </w:rPr>
-              <w:t>一条完整研究闭环 + 一个已修复的科学表述失效模式</w:t>
+              <w:t>分别报告历史关系、预测增益与数据可得性</w:t>
             </w:r>
           </w:p>
         </w:tc>
@@ -3326,7 +3280,7 @@
         <w:pStyle w:val="Heading2"/>
       </w:pPr>
       <w:r>
-        <w:t>6.1 成功案例：从原始问题到可复核发布结果</w:t>
+        <w:t>6.1 三种证据层级的综合解释</w:t>
       </w:r>
     </w:p>
     <w:tbl>
@@ -3358,13 +3312,13 @@
                 <w:b/>
                 <w:color w:val="1E6F74"/>
               </w:rPr>
-              <w:t xml:space="preserve">正式运行结果  </w:t>
+              <w:t xml:space="preserve">综合结论  </w:t>
             </w:r>
             <w:r>
               <w:rPr>
                 <w:sz w:val="18"/>
               </w:rPr>
-              <w:t>本案例从原始研究问题出发，沿“数据核验—假设生成—实验设计—结果复核—发布审查”链条完成闭环。最终没有把三条假设压成同一证据等级：H1 为限域高置信历史关系，H2 为中低置信方向性增益信号，H3 为数据不足、暂不可评级。</w:t>
+              <w:t>三条假设使用不同观测量和验证协议，证据等级分别为：H1 限域高置信历史关系，H2 中低置信方向性增益信号，H3 数据不足、暂不可评级。</w:t>
             </w:r>
           </w:p>
         </w:tc>
@@ -3404,59 +3358,11 @@
     </w:p>
     <w:p>
       <w:pPr>
-        <w:jc w:val="center"/>
-      </w:pPr>
-      <w:r>
-        <w:drawing>
-          <wp:inline xmlns:a="http://schemas.openxmlformats.org/drawingml/2006/main" xmlns:pic="http://schemas.openxmlformats.org/drawingml/2006/picture">
-            <wp:extent cx="5669280" cy="3036608"/>
-            <wp:docPr id="2" name="Picture 2"/>
-            <wp:cNvGraphicFramePr>
-              <a:graphicFrameLocks noChangeAspect="1"/>
-            </wp:cNvGraphicFramePr>
-            <a:graphic>
-              <a:graphicData uri="http://schemas.openxmlformats.org/drawingml/2006/picture">
-                <pic:pic>
-                  <pic:nvPicPr>
-                    <pic:cNvPr id="0" name="screenshot.png"/>
-                    <pic:cNvPicPr/>
-                  </pic:nvPicPr>
-                  <pic:blipFill>
-                    <a:blip r:embed="rId12"/>
-                    <a:stretch>
-                      <a:fillRect/>
-                    </a:stretch>
-                  </pic:blipFill>
-                  <pic:spPr>
-                    <a:xfrm>
-                      <a:off x="0" y="0"/>
-                      <a:ext cx="5669280" cy="3036608"/>
-                    </a:xfrm>
-                    <a:prstGeom prst="rect"/>
-                  </pic:spPr>
-                </pic:pic>
-              </a:graphicData>
-            </a:graphic>
-          </wp:inline>
-        </w:drawing>
-      </w:r>
-    </w:p>
-    <w:p>
-      <w:pPr>
-        <w:spacing w:after="100"/>
-        <w:jc w:val="center"/>
-      </w:pPr>
-      <w:r>
-        <w:t>图 3｜一次完整正式运行的结果页；对应数据、计算结果与复核记录均已归档。</w:t>
-      </w:r>
-    </w:p>
-    <w:p>
-      <w:pPr>
         <w:pStyle w:val="Heading2"/>
         <w:pageBreakBefore/>
       </w:pPr>
       <w:r>
-        <w:t>6.2 已修复的经典失败：把可证伪性误写成同等级实证支持</w:t>
+        <w:t>6.2 常见误判及其控制</w:t>
       </w:r>
     </w:p>
     <w:tbl>
@@ -3752,13 +3658,13 @@
                 <w:b/>
                 <w:color w:val="1E6F74"/>
               </w:rPr>
-              <w:t xml:space="preserve">评委可核对的交付标准  </w:t>
+              <w:t xml:space="preserve">结论发布条件  </w:t>
             </w:r>
             <w:r>
               <w:rPr>
                 <w:sz w:val="18"/>
               </w:rPr>
-              <w:t>研究阶段完成不等于结论成立。最终交付必须给出清晰的结论边界、可复算的关键数字和独立的证据复核。</w:t>
+              <w:t>研究阶段完成不等于结论成立。结论必须给出清晰边界、可复算的关键数字和独立的证据复核。</w:t>
             </w:r>
           </w:p>
         </w:tc>

</xml_diff>